<commit_message>
Deploy whole app on Netlify: run the Express API as a Netlify Function
- netlify/functions/api.ts + Backend/src/serverless.ts wrap createApp() with serverless-http
- pathNormalize middleware maps Netlify function paths onto /api routes (tested)
- seedAdmin moved to Backend/src/seed.ts; admin is seeded lazily on the first request
- PG_POOL_MAX env var for one connection per serverless instance
- netlify.toml: build, functions and redirects (/api/* first, SPA fallback second)
- remove Frontend/public/_redirects (its catch-all would shadow /api/*)
- README, .env.example and installation guide updated

Co-Authored-By: Claude Sonnet 5 <noreply@anthropic.com>
</commit_message>
<xml_diff>
--- a/Documents/Vijay-Dairy-Setup-Guide.docx
+++ b/Documents/Vijay-Dairy-Setup-Guide.docx
@@ -14480,7 +14480,7 @@
           <w:sz w:val="26"/>
           <w:szCs w:val="26"/>
         </w:rPr>
-        <w:t xml:space="preserve">7.5 Alternative: Netlify for the frontend, a separate host for the API</w:t>
+        <w:t xml:space="preserve">7.5 All-in-one on Netlify (frontend + serverless API)</w:t>
       </w:r>
     </w:p>
     <w:p>
@@ -14491,7 +14491,7 @@
         <w:rPr>
           <w:rFonts w:ascii="Calibri" w:cs="Calibri" w:eastAsia="Calibri" w:hAnsi="Calibri"/>
         </w:rPr>
-        <w:t xml:space="preserve">Netlify serves </w:t>
+        <w:t xml:space="preserve">Netlify can host the whole application with </w:t>
       </w:r>
       <w:r>
         <w:rPr>
@@ -14499,13 +14499,13 @@
           <w:b/>
           <w:bCs/>
         </w:rPr>
-        <w:t xml:space="preserve">static files only</w:t>
-      </w:r>
-      <w:r>
-        <w:rPr>
-          <w:rFonts w:ascii="Calibri" w:cs="Calibri" w:eastAsia="Calibri" w:hAnsi="Calibri"/>
-        </w:rPr>
-        <w:t xml:space="preserve">, so it can host the React frontend but </w:t>
+        <w:t xml:space="preserve">no separate API server</w:t>
+      </w:r>
+      <w:r>
+        <w:rPr>
+          <w:rFonts w:ascii="Calibri" w:cs="Calibri" w:eastAsia="Calibri" w:hAnsi="Calibri"/>
+        </w:rPr>
+        <w:t xml:space="preserve">. The React build is served as static files and the same Express API runs as a </w:t>
       </w:r>
       <w:r>
         <w:rPr>
@@ -14513,47 +14513,13 @@
           <w:b/>
           <w:bCs/>
         </w:rPr>
-        <w:t xml:space="preserve">cannot run the Express API</w:t>
-      </w:r>
-      <w:r>
-        <w:rPr>
-          <w:rFonts w:ascii="Calibri" w:cs="Calibri" w:eastAsia="Calibri" w:hAnsi="Calibri"/>
-        </w:rPr>
-        <w:t xml:space="preserve">. Deploy the API to any Node.js host (a VM with PM2/systemd, or a platform such as Render, Railway or Fly.io) and point the Netlify site at it. Supabase stays as the database.</w:t>
-      </w:r>
-    </w:p>
-    <w:p>
-      <w:pPr>
-        <w:pStyle w:val="Heading3"/>
-        <w:keepNext/>
-        <w:spacing w:after="80" w:before="160"/>
-      </w:pPr>
-      <w:r>
-        <w:rPr>
-          <w:rFonts w:ascii="Calibri" w:cs="Calibri" w:eastAsia="Calibri" w:hAnsi="Calibri"/>
-          <w:b/>
-          <w:bCs/>
-          <w:color w:val="0F172A"/>
-          <w:sz w:val="23"/>
-          <w:szCs w:val="23"/>
-        </w:rPr>
-        <w:t xml:space="preserve">Step 1 — Deploy the API first</w:t>
-      </w:r>
-    </w:p>
-    <w:p>
-      <w:pPr>
-        <w:pStyle w:val="ListParagraph"/>
-        <w:numPr>
-          <w:ilvl w:val="0"/>
-          <w:numId w:val="2"/>
-        </w:numPr>
-        <w:spacing w:after="60" w:line="264"/>
-      </w:pPr>
-      <w:r>
-        <w:rPr>
-          <w:rFonts w:ascii="Calibri" w:cs="Calibri" w:eastAsia="Calibri" w:hAnsi="Calibri"/>
-        </w:rPr>
-        <w:t xml:space="preserve">Build command: </w:t>
+        <w:t xml:space="preserve">Netlify Function</w:t>
+      </w:r>
+      <w:r>
+        <w:rPr>
+          <w:rFonts w:ascii="Calibri" w:cs="Calibri" w:eastAsia="Calibri" w:hAnsi="Calibri"/>
+        </w:rPr>
+        <w:t xml:space="preserve"> at </w:t>
       </w:r>
       <w:r>
         <w:rPr>
@@ -14563,13 +14529,13 @@
           <w:szCs w:val="20"/>
           <w:shd w:fill="F1F5F9" w:val="clear"/>
         </w:rPr>
-        <w:t xml:space="preserve">npm ci &amp;&amp; npm run build</w:t>
-      </w:r>
-      <w:r>
-        <w:rPr>
-          <w:rFonts w:ascii="Calibri" w:cs="Calibri" w:eastAsia="Calibri" w:hAnsi="Calibri"/>
-        </w:rPr>
-        <w:t xml:space="preserve"> · Start command: </w:t>
+        <w:t xml:space="preserve">/api</w:t>
+      </w:r>
+      <w:r>
+        <w:rPr>
+          <w:rFonts w:ascii="Calibri" w:cs="Calibri" w:eastAsia="Calibri" w:hAnsi="Calibri"/>
+        </w:rPr>
+        <w:t xml:space="preserve"> on the same domain. Supabase remains the database. Because everything is on one origin, CORS is not needed and </w:t>
       </w:r>
       <w:r>
         <w:rPr>
@@ -14579,13 +14545,13 @@
           <w:szCs w:val="20"/>
           <w:shd w:fill="F1F5F9" w:val="clear"/>
         </w:rPr>
-        <w:t xml:space="preserve">npm start</w:t>
-      </w:r>
-      <w:r>
-        <w:rPr>
-          <w:rFonts w:ascii="Calibri" w:cs="Calibri" w:eastAsia="Calibri" w:hAnsi="Calibri"/>
-        </w:rPr>
-        <w:t xml:space="preserve"> · Root/working directory: </w:t>
+        <w:t xml:space="preserve">VITE_API_URL</w:t>
+      </w:r>
+      <w:r>
+        <w:rPr>
+          <w:rFonts w:ascii="Calibri" w:cs="Calibri" w:eastAsia="Calibri" w:hAnsi="Calibri"/>
+        </w:rPr>
+        <w:t xml:space="preserve"> is simply </w:t>
       </w:r>
       <w:r>
         <w:rPr>
@@ -14595,159 +14561,13 @@
           <w:szCs w:val="20"/>
           <w:shd w:fill="F1F5F9" w:val="clear"/>
         </w:rPr>
-        <w:t xml:space="preserve">Backend</w:t>
+        <w:t xml:space="preserve">/api</w:t>
       </w:r>
       <w:r>
         <w:rPr>
           <w:rFonts w:ascii="Calibri" w:cs="Calibri" w:eastAsia="Calibri" w:hAnsi="Calibri"/>
         </w:rPr>
         <w:t xml:space="preserve">.</w:t>
-      </w:r>
-    </w:p>
-    <w:p>
-      <w:pPr>
-        <w:pStyle w:val="ListParagraph"/>
-        <w:numPr>
-          <w:ilvl w:val="0"/>
-          <w:numId w:val="2"/>
-        </w:numPr>
-        <w:spacing w:after="60" w:line="264"/>
-      </w:pPr>
-      <w:r>
-        <w:rPr>
-          <w:rFonts w:ascii="Calibri" w:cs="Calibri" w:eastAsia="Calibri" w:hAnsi="Calibri"/>
-        </w:rPr>
-        <w:t xml:space="preserve">Set the environment variables from Section 6.1 on that host (</w:t>
-      </w:r>
-      <w:r>
-        <w:rPr>
-          <w:rFonts w:ascii="Consolas" w:cs="Consolas" w:eastAsia="Consolas" w:hAnsi="Consolas"/>
-          <w:color w:val="0F172A"/>
-          <w:sz w:val="20"/>
-          <w:szCs w:val="20"/>
-          <w:shd w:fill="F1F5F9" w:val="clear"/>
-        </w:rPr>
-        <w:t xml:space="preserve">DATABASE_URL</w:t>
-      </w:r>
-      <w:r>
-        <w:rPr>
-          <w:rFonts w:ascii="Calibri" w:cs="Calibri" w:eastAsia="Calibri" w:hAnsi="Calibri"/>
-        </w:rPr>
-        <w:t xml:space="preserve">, </w:t>
-      </w:r>
-      <w:r>
-        <w:rPr>
-          <w:rFonts w:ascii="Consolas" w:cs="Consolas" w:eastAsia="Consolas" w:hAnsi="Consolas"/>
-          <w:color w:val="0F172A"/>
-          <w:sz w:val="20"/>
-          <w:szCs w:val="20"/>
-          <w:shd w:fill="F1F5F9" w:val="clear"/>
-        </w:rPr>
-        <w:t xml:space="preserve">JWT_SECRET</w:t>
-      </w:r>
-      <w:r>
-        <w:rPr>
-          <w:rFonts w:ascii="Calibri" w:cs="Calibri" w:eastAsia="Calibri" w:hAnsi="Calibri"/>
-        </w:rPr>
-        <w:t xml:space="preserve">, </w:t>
-      </w:r>
-      <w:r>
-        <w:rPr>
-          <w:rFonts w:ascii="Consolas" w:cs="Consolas" w:eastAsia="Consolas" w:hAnsi="Consolas"/>
-          <w:color w:val="0F172A"/>
-          <w:sz w:val="20"/>
-          <w:szCs w:val="20"/>
-          <w:shd w:fill="F1F5F9" w:val="clear"/>
-        </w:rPr>
-        <w:t xml:space="preserve">ADMIN_PASSWORD</w:t>
-      </w:r>
-      <w:r>
-        <w:rPr>
-          <w:rFonts w:ascii="Calibri" w:cs="Calibri" w:eastAsia="Calibri" w:hAnsi="Calibri"/>
-        </w:rPr>
-        <w:t xml:space="preserve">, ...). Set </w:t>
-      </w:r>
-      <w:r>
-        <w:rPr>
-          <w:rFonts w:ascii="Consolas" w:cs="Consolas" w:eastAsia="Consolas" w:hAnsi="Consolas"/>
-          <w:color w:val="0F172A"/>
-          <w:sz w:val="20"/>
-          <w:szCs w:val="20"/>
-          <w:shd w:fill="F1F5F9" w:val="clear"/>
-        </w:rPr>
-        <w:t xml:space="preserve">CORS_ORIGINS</w:t>
-      </w:r>
-      <w:r>
-        <w:rPr>
-          <w:rFonts w:ascii="Calibri" w:cs="Calibri" w:eastAsia="Calibri" w:hAnsi="Calibri"/>
-        </w:rPr>
-        <w:t xml:space="preserve"> to your Netlify address, for example </w:t>
-      </w:r>
-      <w:r>
-        <w:rPr>
-          <w:rFonts w:ascii="Consolas" w:cs="Consolas" w:eastAsia="Consolas" w:hAnsi="Consolas"/>
-          <w:color w:val="0F172A"/>
-          <w:sz w:val="20"/>
-          <w:szCs w:val="20"/>
-          <w:shd w:fill="F1F5F9" w:val="clear"/>
-        </w:rPr>
-        <w:t xml:space="preserve">https://your-site.netlify.app</w:t>
-      </w:r>
-      <w:r>
-        <w:rPr>
-          <w:rFonts w:ascii="Calibri" w:cs="Calibri" w:eastAsia="Calibri" w:hAnsi="Calibri"/>
-        </w:rPr>
-        <w:t xml:space="preserve">.</w:t>
-      </w:r>
-    </w:p>
-    <w:p>
-      <w:pPr>
-        <w:pStyle w:val="ListParagraph"/>
-        <w:numPr>
-          <w:ilvl w:val="0"/>
-          <w:numId w:val="2"/>
-        </w:numPr>
-        <w:spacing w:after="60" w:line="264"/>
-      </w:pPr>
-      <w:r>
-        <w:rPr>
-          <w:rFonts w:ascii="Calibri" w:cs="Calibri" w:eastAsia="Calibri" w:hAnsi="Calibri"/>
-        </w:rPr>
-        <w:t xml:space="preserve">Note the public HTTPS address of the API, for example </w:t>
-      </w:r>
-      <w:r>
-        <w:rPr>
-          <w:rFonts w:ascii="Consolas" w:cs="Consolas" w:eastAsia="Consolas" w:hAnsi="Consolas"/>
-          <w:color w:val="0F172A"/>
-          <w:sz w:val="20"/>
-          <w:szCs w:val="20"/>
-          <w:shd w:fill="F1F5F9" w:val="clear"/>
-        </w:rPr>
-        <w:t xml:space="preserve">https://vijay-dairy-api.example.com</w:t>
-      </w:r>
-      <w:r>
-        <w:rPr>
-          <w:rFonts w:ascii="Calibri" w:cs="Calibri" w:eastAsia="Calibri" w:hAnsi="Calibri"/>
-        </w:rPr>
-        <w:t xml:space="preserve">.</w:t>
-      </w:r>
-    </w:p>
-    <w:p>
-      <w:pPr>
-        <w:pStyle w:val="Heading3"/>
-        <w:keepNext/>
-        <w:spacing w:after="80" w:before="160"/>
-      </w:pPr>
-      <w:r>
-        <w:rPr>
-          <w:rFonts w:ascii="Calibri" w:cs="Calibri" w:eastAsia="Calibri" w:hAnsi="Calibri"/>
-          <w:b/>
-          <w:bCs/>
-          <w:color w:val="0F172A"/>
-          <w:sz w:val="23"/>
-          <w:szCs w:val="23"/>
-        </w:rPr>
-        <w:t xml:space="preserve">Step 2 — Configure the Netlify site</w:t>
       </w:r>
     </w:p>
     <w:tbl>
@@ -14763,442 +14583,146 @@
         </w:tblBorders>
       </w:tblPr>
       <w:tblGrid>
-        <w:gridCol w:w="2600"/>
-        <w:gridCol w:w="6426"/>
+        <w:gridCol w:w="9026"/>
       </w:tblGrid>
       <w:tr>
         <w:trPr>
           <w:cantSplit/>
-          <w:tblHeader/>
         </w:trPr>
         <w:tc>
           <w:tcPr>
-            <w:tcW w:type="dxa" w:w="2600"/>
-            <w:tcBorders>
-              <w:top w:val="single" w:color="CBD5E1" w:sz="4"/>
-              <w:left w:val="single" w:color="CBD5E1" w:sz="4"/>
-              <w:bottom w:val="single" w:color="CBD5E1" w:sz="4"/>
-              <w:right w:val="single" w:color="CBD5E1" w:sz="4"/>
-            </w:tcBorders>
-            <w:shd w:fill="15803D" w:val="clear"/>
-            <w:tcMar>
-              <w:top w:type="dxa" w:w="70"/>
-              <w:left w:type="dxa" w:w="110"/>
-              <w:bottom w:type="dxa" w:w="70"/>
-              <w:right w:type="dxa" w:w="110"/>
-            </w:tcMar>
-          </w:tcPr>
-          <w:p>
-            <w:pPr>
-              <w:spacing w:after="20" w:line="250"/>
+            <w:tcW w:type="dxa" w:w="9026"/>
+            <w:tcBorders>
+              <w:top w:val="none" w:color="FFFFFF" w:sz="0"/>
+              <w:left w:val="single" w:color="2563EB" w:sz="24"/>
+              <w:bottom w:val="none" w:color="FFFFFF" w:sz="0"/>
+              <w:right w:val="none" w:color="FFFFFF" w:sz="0"/>
+            </w:tcBorders>
+            <w:shd w:fill="EFF6FF" w:val="clear"/>
+            <w:tcMar>
+              <w:top w:type="dxa" w:w="100"/>
+              <w:left w:type="dxa" w:w="180"/>
+              <w:bottom w:type="dxa" w:w="100"/>
+              <w:right w:type="dxa" w:w="160"/>
+            </w:tcMar>
+          </w:tcPr>
+          <w:p>
+            <w:pPr>
+              <w:spacing w:after="40"/>
             </w:pPr>
             <w:r>
               <w:rPr>
                 <w:rFonts w:ascii="Calibri" w:cs="Calibri" w:eastAsia="Calibri" w:hAnsi="Calibri"/>
                 <w:b/>
                 <w:bCs/>
-                <w:color w:val="FFFFFF"/>
-                <w:sz w:val="20"/>
-                <w:szCs w:val="20"/>
-              </w:rPr>
-              <w:t xml:space="preserve">Netlify field</w:t>
-            </w:r>
-          </w:p>
-        </w:tc>
-        <w:tc>
-          <w:tcPr>
-            <w:tcW w:type="dxa" w:w="6426"/>
-            <w:tcBorders>
-              <w:top w:val="single" w:color="CBD5E1" w:sz="4"/>
-              <w:left w:val="single" w:color="CBD5E1" w:sz="4"/>
-              <w:bottom w:val="single" w:color="CBD5E1" w:sz="4"/>
-              <w:right w:val="single" w:color="CBD5E1" w:sz="4"/>
-            </w:tcBorders>
-            <w:shd w:fill="15803D" w:val="clear"/>
-            <w:tcMar>
-              <w:top w:type="dxa" w:w="70"/>
-              <w:left w:type="dxa" w:w="110"/>
-              <w:bottom w:type="dxa" w:w="70"/>
-              <w:right w:type="dxa" w:w="110"/>
-            </w:tcMar>
-          </w:tcPr>
-          <w:p>
-            <w:pPr>
-              <w:spacing w:after="20" w:line="250"/>
-            </w:pPr>
-            <w:r>
-              <w:rPr>
-                <w:rFonts w:ascii="Calibri" w:cs="Calibri" w:eastAsia="Calibri" w:hAnsi="Calibri"/>
-                <w:b/>
-                <w:bCs/>
-                <w:color w:val="FFFFFF"/>
-                <w:sz w:val="20"/>
-                <w:szCs w:val="20"/>
-              </w:rPr>
-              <w:t xml:space="preserve">Value</w:t>
-            </w:r>
-          </w:p>
-        </w:tc>
-      </w:tr>
-      <w:tr>
-        <w:trPr>
-          <w:cantSplit/>
-        </w:trPr>
-        <w:tc>
-          <w:tcPr>
-            <w:tcW w:type="dxa" w:w="2600"/>
-            <w:tcBorders>
-              <w:top w:val="single" w:color="CBD5E1" w:sz="4"/>
-              <w:left w:val="single" w:color="CBD5E1" w:sz="4"/>
-              <w:bottom w:val="single" w:color="CBD5E1" w:sz="4"/>
-              <w:right w:val="single" w:color="CBD5E1" w:sz="4"/>
-            </w:tcBorders>
-            <w:tcMar>
-              <w:top w:type="dxa" w:w="70"/>
-              <w:left w:type="dxa" w:w="110"/>
-              <w:bottom w:type="dxa" w:w="70"/>
-              <w:right w:type="dxa" w:w="110"/>
-            </w:tcMar>
-          </w:tcPr>
-          <w:p>
-            <w:pPr>
-              <w:spacing w:after="20" w:line="250"/>
-            </w:pPr>
-            <w:r>
-              <w:rPr>
-                <w:rFonts w:ascii="Calibri" w:cs="Calibri" w:eastAsia="Calibri" w:hAnsi="Calibri"/>
-                <w:sz w:val="20"/>
-                <w:szCs w:val="20"/>
-              </w:rPr>
-              <w:t xml:space="preserve">Branch to deploy</w:t>
-            </w:r>
-          </w:p>
-        </w:tc>
-        <w:tc>
-          <w:tcPr>
-            <w:tcW w:type="dxa" w:w="6426"/>
-            <w:tcBorders>
-              <w:top w:val="single" w:color="CBD5E1" w:sz="4"/>
-              <w:left w:val="single" w:color="CBD5E1" w:sz="4"/>
-              <w:bottom w:val="single" w:color="CBD5E1" w:sz="4"/>
-              <w:right w:val="single" w:color="CBD5E1" w:sz="4"/>
-            </w:tcBorders>
-            <w:tcMar>
-              <w:top w:type="dxa" w:w="70"/>
-              <w:left w:type="dxa" w:w="110"/>
-              <w:bottom w:type="dxa" w:w="70"/>
-              <w:right w:type="dxa" w:w="110"/>
-            </w:tcMar>
-          </w:tcPr>
-          <w:p>
-            <w:pPr>
-              <w:spacing w:after="20" w:line="250"/>
-            </w:pPr>
-            <w:r>
-              <w:rPr>
-                <w:rFonts w:ascii="Consolas" w:cs="Consolas" w:eastAsia="Consolas" w:hAnsi="Consolas"/>
-                <w:color w:val="0F172A"/>
-                <w:sz w:val="18"/>
-                <w:szCs w:val="18"/>
+                <w:color w:val="2563EB"/>
+                <w:sz w:val="20"/>
+                <w:szCs w:val="20"/>
+              </w:rPr>
+              <w:t xml:space="preserve">NOTE — How it works</w:t>
+            </w:r>
+          </w:p>
+          <w:p>
+            <w:pPr>
+              <w:spacing w:after="0" w:line="264"/>
+            </w:pPr>
+            <w:r>
+              <w:rPr>
+                <w:rFonts w:ascii="Calibri" w:cs="Calibri" w:eastAsia="Calibri" w:hAnsi="Calibri"/>
+                <w:sz w:val="21"/>
+                <w:szCs w:val="21"/>
+              </w:rPr>
+              <w:t xml:space="preserve">The repository contains </w:t>
+            </w:r>
+            <w:r>
+              <w:rPr>
+                <w:rFonts w:ascii="Consolas" w:cs="Consolas" w:eastAsia="Consolas" w:hAnsi="Consolas"/>
+                <w:color w:val="0F172A"/>
+                <w:sz w:val="19"/>
+                <w:szCs w:val="19"/>
                 <w:shd w:fill="F1F5F9" w:val="clear"/>
               </w:rPr>
-              <w:t xml:space="preserve">main</w:t>
-            </w:r>
-          </w:p>
-        </w:tc>
-      </w:tr>
-      <w:tr>
-        <w:trPr>
-          <w:cantSplit/>
-        </w:trPr>
-        <w:tc>
-          <w:tcPr>
-            <w:tcW w:type="dxa" w:w="2600"/>
-            <w:tcBorders>
-              <w:top w:val="single" w:color="CBD5E1" w:sz="4"/>
-              <w:left w:val="single" w:color="CBD5E1" w:sz="4"/>
-              <w:bottom w:val="single" w:color="CBD5E1" w:sz="4"/>
-              <w:right w:val="single" w:color="CBD5E1" w:sz="4"/>
-            </w:tcBorders>
-            <w:shd w:fill="F8FAFC" w:val="clear"/>
-            <w:tcMar>
-              <w:top w:type="dxa" w:w="70"/>
-              <w:left w:type="dxa" w:w="110"/>
-              <w:bottom w:type="dxa" w:w="70"/>
-              <w:right w:type="dxa" w:w="110"/>
-            </w:tcMar>
-          </w:tcPr>
-          <w:p>
-            <w:pPr>
-              <w:spacing w:after="20" w:line="250"/>
-            </w:pPr>
-            <w:r>
-              <w:rPr>
-                <w:rFonts w:ascii="Calibri" w:cs="Calibri" w:eastAsia="Calibri" w:hAnsi="Calibri"/>
-                <w:sz w:val="20"/>
-                <w:szCs w:val="20"/>
-              </w:rPr>
-              <w:t xml:space="preserve">Base directory</w:t>
-            </w:r>
-          </w:p>
-        </w:tc>
-        <w:tc>
-          <w:tcPr>
-            <w:tcW w:type="dxa" w:w="6426"/>
-            <w:tcBorders>
-              <w:top w:val="single" w:color="CBD5E1" w:sz="4"/>
-              <w:left w:val="single" w:color="CBD5E1" w:sz="4"/>
-              <w:bottom w:val="single" w:color="CBD5E1" w:sz="4"/>
-              <w:right w:val="single" w:color="CBD5E1" w:sz="4"/>
-            </w:tcBorders>
-            <w:shd w:fill="F8FAFC" w:val="clear"/>
-            <w:tcMar>
-              <w:top w:type="dxa" w:w="70"/>
-              <w:left w:type="dxa" w:w="110"/>
-              <w:bottom w:type="dxa" w:w="70"/>
-              <w:right w:type="dxa" w:w="110"/>
-            </w:tcMar>
-          </w:tcPr>
-          <w:p>
-            <w:pPr>
-              <w:spacing w:after="20" w:line="250"/>
-            </w:pPr>
-            <w:r>
-              <w:rPr>
-                <w:rFonts w:ascii="Consolas" w:cs="Consolas" w:eastAsia="Consolas" w:hAnsi="Consolas"/>
-                <w:color w:val="0F172A"/>
-                <w:sz w:val="18"/>
-                <w:szCs w:val="18"/>
+              <w:t xml:space="preserve">netlify.toml</w:t>
+            </w:r>
+            <w:r>
+              <w:rPr>
+                <w:rFonts w:ascii="Calibri" w:cs="Calibri" w:eastAsia="Calibri" w:hAnsi="Calibri"/>
+                <w:sz w:val="21"/>
+                <w:szCs w:val="21"/>
+              </w:rPr>
+              <w:t xml:space="preserve"> (build settings and redirects) and </w:t>
+            </w:r>
+            <w:r>
+              <w:rPr>
+                <w:rFonts w:ascii="Consolas" w:cs="Consolas" w:eastAsia="Consolas" w:hAnsi="Consolas"/>
+                <w:color w:val="0F172A"/>
+                <w:sz w:val="19"/>
+                <w:szCs w:val="19"/>
                 <w:shd w:fill="F1F5F9" w:val="clear"/>
               </w:rPr>
-              <w:t xml:space="preserve">Frontend</w:t>
-            </w:r>
-          </w:p>
-        </w:tc>
-      </w:tr>
-      <w:tr>
-        <w:trPr>
-          <w:cantSplit/>
-        </w:trPr>
-        <w:tc>
-          <w:tcPr>
-            <w:tcW w:type="dxa" w:w="2600"/>
-            <w:tcBorders>
-              <w:top w:val="single" w:color="CBD5E1" w:sz="4"/>
-              <w:left w:val="single" w:color="CBD5E1" w:sz="4"/>
-              <w:bottom w:val="single" w:color="CBD5E1" w:sz="4"/>
-              <w:right w:val="single" w:color="CBD5E1" w:sz="4"/>
-            </w:tcBorders>
-            <w:tcMar>
-              <w:top w:type="dxa" w:w="70"/>
-              <w:left w:type="dxa" w:w="110"/>
-              <w:bottom w:type="dxa" w:w="70"/>
-              <w:right w:type="dxa" w:w="110"/>
-            </w:tcMar>
-          </w:tcPr>
-          <w:p>
-            <w:pPr>
-              <w:spacing w:after="20" w:line="250"/>
-            </w:pPr>
-            <w:r>
-              <w:rPr>
-                <w:rFonts w:ascii="Calibri" w:cs="Calibri" w:eastAsia="Calibri" w:hAnsi="Calibri"/>
-                <w:sz w:val="20"/>
-                <w:szCs w:val="20"/>
-              </w:rPr>
-              <w:t xml:space="preserve">Build command</w:t>
-            </w:r>
-          </w:p>
-        </w:tc>
-        <w:tc>
-          <w:tcPr>
-            <w:tcW w:type="dxa" w:w="6426"/>
-            <w:tcBorders>
-              <w:top w:val="single" w:color="CBD5E1" w:sz="4"/>
-              <w:left w:val="single" w:color="CBD5E1" w:sz="4"/>
-              <w:bottom w:val="single" w:color="CBD5E1" w:sz="4"/>
-              <w:right w:val="single" w:color="CBD5E1" w:sz="4"/>
-            </w:tcBorders>
-            <w:tcMar>
-              <w:top w:type="dxa" w:w="70"/>
-              <w:left w:type="dxa" w:w="110"/>
-              <w:bottom w:type="dxa" w:w="70"/>
-              <w:right w:type="dxa" w:w="110"/>
-            </w:tcMar>
-          </w:tcPr>
-          <w:p>
-            <w:pPr>
-              <w:spacing w:after="20" w:line="250"/>
-            </w:pPr>
-            <w:r>
-              <w:rPr>
-                <w:rFonts w:ascii="Consolas" w:cs="Consolas" w:eastAsia="Consolas" w:hAnsi="Consolas"/>
-                <w:color w:val="0F172A"/>
-                <w:sz w:val="18"/>
-                <w:szCs w:val="18"/>
+              <w:t xml:space="preserve">netlify/functions/api.ts</w:t>
+            </w:r>
+            <w:r>
+              <w:rPr>
+                <w:rFonts w:ascii="Calibri" w:cs="Calibri" w:eastAsia="Calibri" w:hAnsi="Calibri"/>
+                <w:sz w:val="21"/>
+                <w:szCs w:val="21"/>
+              </w:rPr>
+              <w:t xml:space="preserve"> (a two-line entry that loads </w:t>
+            </w:r>
+            <w:r>
+              <w:rPr>
+                <w:rFonts w:ascii="Consolas" w:cs="Consolas" w:eastAsia="Consolas" w:hAnsi="Consolas"/>
+                <w:color w:val="0F172A"/>
+                <w:sz w:val="19"/>
+                <w:szCs w:val="19"/>
                 <w:shd w:fill="F1F5F9" w:val="clear"/>
               </w:rPr>
-              <w:t xml:space="preserve">npm run build</w:t>
-            </w:r>
-          </w:p>
-        </w:tc>
-      </w:tr>
-      <w:tr>
-        <w:trPr>
-          <w:cantSplit/>
-        </w:trPr>
-        <w:tc>
-          <w:tcPr>
-            <w:tcW w:type="dxa" w:w="2600"/>
-            <w:tcBorders>
-              <w:top w:val="single" w:color="CBD5E1" w:sz="4"/>
-              <w:left w:val="single" w:color="CBD5E1" w:sz="4"/>
-              <w:bottom w:val="single" w:color="CBD5E1" w:sz="4"/>
-              <w:right w:val="single" w:color="CBD5E1" w:sz="4"/>
-            </w:tcBorders>
-            <w:shd w:fill="F8FAFC" w:val="clear"/>
-            <w:tcMar>
-              <w:top w:type="dxa" w:w="70"/>
-              <w:left w:type="dxa" w:w="110"/>
-              <w:bottom w:type="dxa" w:w="70"/>
-              <w:right w:type="dxa" w:w="110"/>
-            </w:tcMar>
-          </w:tcPr>
-          <w:p>
-            <w:pPr>
-              <w:spacing w:after="20" w:line="250"/>
-            </w:pPr>
-            <w:r>
-              <w:rPr>
-                <w:rFonts w:ascii="Calibri" w:cs="Calibri" w:eastAsia="Calibri" w:hAnsi="Calibri"/>
-                <w:sz w:val="20"/>
-                <w:szCs w:val="20"/>
-              </w:rPr>
-              <w:t xml:space="preserve">Publish directory</w:t>
-            </w:r>
-          </w:p>
-        </w:tc>
-        <w:tc>
-          <w:tcPr>
-            <w:tcW w:type="dxa" w:w="6426"/>
-            <w:tcBorders>
-              <w:top w:val="single" w:color="CBD5E1" w:sz="4"/>
-              <w:left w:val="single" w:color="CBD5E1" w:sz="4"/>
-              <w:bottom w:val="single" w:color="CBD5E1" w:sz="4"/>
-              <w:right w:val="single" w:color="CBD5E1" w:sz="4"/>
-            </w:tcBorders>
-            <w:shd w:fill="F8FAFC" w:val="clear"/>
-            <w:tcMar>
-              <w:top w:type="dxa" w:w="70"/>
-              <w:left w:type="dxa" w:w="110"/>
-              <w:bottom w:type="dxa" w:w="70"/>
-              <w:right w:type="dxa" w:w="110"/>
-            </w:tcMar>
-          </w:tcPr>
-          <w:p>
-            <w:pPr>
-              <w:spacing w:after="20" w:line="250"/>
-            </w:pPr>
-            <w:r>
-              <w:rPr>
-                <w:rFonts w:ascii="Consolas" w:cs="Consolas" w:eastAsia="Consolas" w:hAnsi="Consolas"/>
-                <w:color w:val="0F172A"/>
-                <w:sz w:val="18"/>
-                <w:szCs w:val="18"/>
+              <w:t xml:space="preserve">Backend/src/serverless.ts</w:t>
+            </w:r>
+            <w:r>
+              <w:rPr>
+                <w:rFonts w:ascii="Calibri" w:cs="Calibri" w:eastAsia="Calibri" w:hAnsi="Calibri"/>
+                <w:sz w:val="21"/>
+                <w:szCs w:val="21"/>
+              </w:rPr>
+              <w:t xml:space="preserve">). </w:t>
+            </w:r>
+            <w:r>
+              <w:rPr>
+                <w:rFonts w:ascii="Consolas" w:cs="Consolas" w:eastAsia="Consolas" w:hAnsi="Consolas"/>
+                <w:color w:val="0F172A"/>
+                <w:sz w:val="19"/>
+                <w:szCs w:val="19"/>
                 <w:shd w:fill="F1F5F9" w:val="clear"/>
               </w:rPr>
-              <w:t xml:space="preserve">dist</w:t>
-            </w:r>
-            <w:r>
-              <w:rPr>
-                <w:rFonts w:ascii="Calibri" w:cs="Calibri" w:eastAsia="Calibri" w:hAnsi="Calibri"/>
-                <w:sz w:val="20"/>
-                <w:szCs w:val="20"/>
-              </w:rPr>
-              <w:t xml:space="preserve"> (if Netlify reports that the directory is not found, use </w:t>
-            </w:r>
-            <w:r>
-              <w:rPr>
-                <w:rFonts w:ascii="Consolas" w:cs="Consolas" w:eastAsia="Consolas" w:hAnsi="Consolas"/>
-                <w:color w:val="0F172A"/>
-                <w:sz w:val="18"/>
-                <w:szCs w:val="18"/>
+              <w:t xml:space="preserve">/api/*</w:t>
+            </w:r>
+            <w:r>
+              <w:rPr>
+                <w:rFonts w:ascii="Calibri" w:cs="Calibri" w:eastAsia="Calibri" w:hAnsi="Calibri"/>
+                <w:sz w:val="21"/>
+                <w:szCs w:val="21"/>
+              </w:rPr>
+              <w:t xml:space="preserve"> is rewritten to the function; every other path falls back to </w:t>
+            </w:r>
+            <w:r>
+              <w:rPr>
+                <w:rFonts w:ascii="Consolas" w:cs="Consolas" w:eastAsia="Consolas" w:hAnsi="Consolas"/>
+                <w:color w:val="0F172A"/>
+                <w:sz w:val="19"/>
+                <w:szCs w:val="19"/>
                 <w:shd w:fill="F1F5F9" w:val="clear"/>
               </w:rPr>
-              <w:t xml:space="preserve">Frontend/dist</w:t>
-            </w:r>
-            <w:r>
-              <w:rPr>
-                <w:rFonts w:ascii="Calibri" w:cs="Calibri" w:eastAsia="Calibri" w:hAnsi="Calibri"/>
-                <w:sz w:val="20"/>
-                <w:szCs w:val="20"/>
-              </w:rPr>
-              <w:t xml:space="preserve">)</w:t>
-            </w:r>
-          </w:p>
-        </w:tc>
-      </w:tr>
-      <w:tr>
-        <w:trPr>
-          <w:cantSplit/>
-        </w:trPr>
-        <w:tc>
-          <w:tcPr>
-            <w:tcW w:type="dxa" w:w="2600"/>
-            <w:tcBorders>
-              <w:top w:val="single" w:color="CBD5E1" w:sz="4"/>
-              <w:left w:val="single" w:color="CBD5E1" w:sz="4"/>
-              <w:bottom w:val="single" w:color="CBD5E1" w:sz="4"/>
-              <w:right w:val="single" w:color="CBD5E1" w:sz="4"/>
-            </w:tcBorders>
-            <w:tcMar>
-              <w:top w:type="dxa" w:w="70"/>
-              <w:left w:type="dxa" w:w="110"/>
-              <w:bottom w:type="dxa" w:w="70"/>
-              <w:right w:type="dxa" w:w="110"/>
-            </w:tcMar>
-          </w:tcPr>
-          <w:p>
-            <w:pPr>
-              <w:spacing w:after="20" w:line="250"/>
-            </w:pPr>
-            <w:r>
-              <w:rPr>
-                <w:rFonts w:ascii="Calibri" w:cs="Calibri" w:eastAsia="Calibri" w:hAnsi="Calibri"/>
-                <w:sz w:val="20"/>
-                <w:szCs w:val="20"/>
-              </w:rPr>
-              <w:t xml:space="preserve">Functions directory</w:t>
-            </w:r>
-          </w:p>
-        </w:tc>
-        <w:tc>
-          <w:tcPr>
-            <w:tcW w:type="dxa" w:w="6426"/>
-            <w:tcBorders>
-              <w:top w:val="single" w:color="CBD5E1" w:sz="4"/>
-              <w:left w:val="single" w:color="CBD5E1" w:sz="4"/>
-              <w:bottom w:val="single" w:color="CBD5E1" w:sz="4"/>
-              <w:right w:val="single" w:color="CBD5E1" w:sz="4"/>
-            </w:tcBorders>
-            <w:tcMar>
-              <w:top w:type="dxa" w:w="70"/>
-              <w:left w:type="dxa" w:w="110"/>
-              <w:bottom w:type="dxa" w:w="70"/>
-              <w:right w:type="dxa" w:w="110"/>
-            </w:tcMar>
-          </w:tcPr>
-          <w:p>
-            <w:pPr>
-              <w:spacing w:after="20" w:line="250"/>
-            </w:pPr>
-            <w:r>
-              <w:rPr>
-                <w:rFonts w:ascii="Calibri" w:cs="Calibri" w:eastAsia="Calibri" w:hAnsi="Calibri"/>
-                <w:sz w:val="20"/>
-                <w:szCs w:val="20"/>
-              </w:rPr>
-              <w:t xml:space="preserve">Leave empty — the project uses no Netlify Functions.</w:t>
+              <w:t xml:space="preserve">index.html</w:t>
+            </w:r>
+            <w:r>
+              <w:rPr>
+                <w:rFonts w:ascii="Calibri" w:cs="Calibri" w:eastAsia="Calibri" w:hAnsi="Calibri"/>
+                <w:sz w:val="21"/>
+                <w:szCs w:val="21"/>
+              </w:rPr>
+              <w:t xml:space="preserve">. The API code is unchanged — it is the same app you run locally.</w:t>
             </w:r>
           </w:p>
         </w:tc>
@@ -15206,18 +14730,36 @@
     </w:tbl>
     <w:p>
       <w:pPr>
-        <w:spacing w:after="80"/>
+        <w:pStyle w:val="Heading3"/>
+        <w:keepNext/>
+        <w:spacing w:after="80" w:before="160"/>
       </w:pPr>
+      <w:r>
+        <w:rPr>
+          <w:rFonts w:ascii="Calibri" w:cs="Calibri" w:eastAsia="Calibri" w:hAnsi="Calibri"/>
+          <w:b/>
+          <w:bCs/>
+          <w:color w:val="0F172A"/>
+          <w:sz w:val="23"/>
+          <w:szCs w:val="23"/>
+        </w:rPr>
+        <w:t xml:space="preserve">Step 1 — Prepare the database connection</w:t>
+      </w:r>
     </w:p>
     <w:p>
       <w:pPr>
-        <w:spacing w:after="120" w:line="276"/>
+        <w:pStyle w:val="ListParagraph"/>
+        <w:numPr>
+          <w:ilvl w:val="0"/>
+          <w:numId w:val="2"/>
+        </w:numPr>
+        <w:spacing w:after="60" w:line="264"/>
       </w:pPr>
       <w:r>
         <w:rPr>
           <w:rFonts w:ascii="Calibri" w:cs="Calibri" w:eastAsia="Calibri" w:hAnsi="Calibri"/>
         </w:rPr>
-        <w:t xml:space="preserve">Under </w:t>
+        <w:t xml:space="preserve">In Supabase choose </w:t>
       </w:r>
       <w:r>
         <w:rPr>
@@ -15225,13 +14767,254 @@
           <w:b/>
           <w:bCs/>
         </w:rPr>
-        <w:t xml:space="preserve">Site configuration → Environment variables</w:t>
-      </w:r>
-      <w:r>
-        <w:rPr>
-          <w:rFonts w:ascii="Calibri" w:cs="Calibri" w:eastAsia="Calibri" w:hAnsi="Calibri"/>
-        </w:rPr>
-        <w:t xml:space="preserve"> add:</w:t>
+        <w:t xml:space="preserve">Connect → Transaction pooler</w:t>
+      </w:r>
+      <w:r>
+        <w:rPr>
+          <w:rFonts w:ascii="Calibri" w:cs="Calibri" w:eastAsia="Calibri" w:hAnsi="Calibri"/>
+        </w:rPr>
+        <w:t xml:space="preserve"> and copy the URI (port </w:t>
+      </w:r>
+      <w:r>
+        <w:rPr>
+          <w:rFonts w:ascii="Calibri" w:cs="Calibri" w:eastAsia="Calibri" w:hAnsi="Calibri"/>
+          <w:b/>
+          <w:bCs/>
+        </w:rPr>
+        <w:t xml:space="preserve">6543</w:t>
+      </w:r>
+      <w:r>
+        <w:rPr>
+          <w:rFonts w:ascii="Calibri" w:cs="Calibri" w:eastAsia="Calibri" w:hAnsi="Calibri"/>
+        </w:rPr>
+        <w:t xml:space="preserve">). Serverless functions open many short-lived connections; the transaction pooler is designed for that.</w:t>
+      </w:r>
+    </w:p>
+    <w:p>
+      <w:pPr>
+        <w:pStyle w:val="ListParagraph"/>
+        <w:numPr>
+          <w:ilvl w:val="0"/>
+          <w:numId w:val="2"/>
+        </w:numPr>
+        <w:spacing w:after="60" w:line="264"/>
+      </w:pPr>
+      <w:r>
+        <w:rPr>
+          <w:rFonts w:ascii="Calibri" w:cs="Calibri" w:eastAsia="Calibri" w:hAnsi="Calibri"/>
+        </w:rPr>
+        <w:t xml:space="preserve">Replace </w:t>
+      </w:r>
+      <w:r>
+        <w:rPr>
+          <w:rFonts w:ascii="Consolas" w:cs="Consolas" w:eastAsia="Consolas" w:hAnsi="Consolas"/>
+          <w:color w:val="0F172A"/>
+          <w:sz w:val="20"/>
+          <w:szCs w:val="20"/>
+          <w:shd w:fill="F1F5F9" w:val="clear"/>
+        </w:rPr>
+        <w:t xml:space="preserve">&lt;password&gt;</w:t>
+      </w:r>
+      <w:r>
+        <w:rPr>
+          <w:rFonts w:ascii="Calibri" w:cs="Calibri" w:eastAsia="Calibri" w:hAnsi="Calibri"/>
+        </w:rPr>
+        <w:t xml:space="preserve"> with the database password and URL-encode special characters (</w:t>
+      </w:r>
+      <w:r>
+        <w:rPr>
+          <w:rFonts w:ascii="Consolas" w:cs="Consolas" w:eastAsia="Consolas" w:hAnsi="Consolas"/>
+          <w:color w:val="0F172A"/>
+          <w:sz w:val="20"/>
+          <w:szCs w:val="20"/>
+          <w:shd w:fill="F1F5F9" w:val="clear"/>
+        </w:rPr>
+        <w:t xml:space="preserve">@</w:t>
+      </w:r>
+      <w:r>
+        <w:rPr>
+          <w:rFonts w:ascii="Calibri" w:cs="Calibri" w:eastAsia="Calibri" w:hAnsi="Calibri"/>
+        </w:rPr>
+        <w:t xml:space="preserve"> → </w:t>
+      </w:r>
+      <w:r>
+        <w:rPr>
+          <w:rFonts w:ascii="Consolas" w:cs="Consolas" w:eastAsia="Consolas" w:hAnsi="Consolas"/>
+          <w:color w:val="0F172A"/>
+          <w:sz w:val="20"/>
+          <w:szCs w:val="20"/>
+          <w:shd w:fill="F1F5F9" w:val="clear"/>
+        </w:rPr>
+        <w:t xml:space="preserve">%40</w:t>
+      </w:r>
+      <w:r>
+        <w:rPr>
+          <w:rFonts w:ascii="Calibri" w:cs="Calibri" w:eastAsia="Calibri" w:hAnsi="Calibri"/>
+        </w:rPr>
+        <w:t xml:space="preserve">).</w:t>
+      </w:r>
+    </w:p>
+    <w:p>
+      <w:pPr>
+        <w:pStyle w:val="Heading3"/>
+        <w:keepNext/>
+        <w:spacing w:after="80" w:before="160"/>
+      </w:pPr>
+      <w:r>
+        <w:rPr>
+          <w:rFonts w:ascii="Calibri" w:cs="Calibri" w:eastAsia="Calibri" w:hAnsi="Calibri"/>
+          <w:b/>
+          <w:bCs/>
+          <w:color w:val="0F172A"/>
+          <w:sz w:val="23"/>
+          <w:szCs w:val="23"/>
+        </w:rPr>
+        <w:t xml:space="preserve">Step 2 — Create the Netlify site</w:t>
+      </w:r>
+    </w:p>
+    <w:p>
+      <w:pPr>
+        <w:keepNext w:val="false"/>
+        <w:spacing w:after="80" w:before="100" w:line="276"/>
+      </w:pPr>
+      <w:r>
+        <w:rPr>
+          <w:rFonts w:ascii="Calibri" w:cs="Calibri" w:eastAsia="Calibri" w:hAnsi="Calibri"/>
+          <w:b/>
+          <w:bCs/>
+          <w:color w:val="15803D"/>
+        </w:rPr>
+        <w:t xml:space="preserve">2.1  </w:t>
+      </w:r>
+      <w:r>
+        <w:rPr>
+          <w:rFonts w:ascii="Calibri" w:cs="Calibri" w:eastAsia="Calibri" w:hAnsi="Calibri"/>
+        </w:rPr>
+        <w:t xml:space="preserve">In Netlify choose </w:t>
+      </w:r>
+      <w:r>
+        <w:rPr>
+          <w:rFonts w:ascii="Calibri" w:cs="Calibri" w:eastAsia="Calibri" w:hAnsi="Calibri"/>
+          <w:b/>
+          <w:bCs/>
+        </w:rPr>
+        <w:t xml:space="preserve">Add new site → Import an existing project</w:t>
+      </w:r>
+      <w:r>
+        <w:rPr>
+          <w:rFonts w:ascii="Calibri" w:cs="Calibri" w:eastAsia="Calibri" w:hAnsi="Calibri"/>
+        </w:rPr>
+        <w:t xml:space="preserve">, connect GitHub and select the repository. Branch to deploy: </w:t>
+      </w:r>
+      <w:r>
+        <w:rPr>
+          <w:rFonts w:ascii="Consolas" w:cs="Consolas" w:eastAsia="Consolas" w:hAnsi="Consolas"/>
+          <w:color w:val="0F172A"/>
+          <w:sz w:val="20"/>
+          <w:szCs w:val="20"/>
+          <w:shd w:fill="F1F5F9" w:val="clear"/>
+        </w:rPr>
+        <w:t xml:space="preserve">main</w:t>
+      </w:r>
+      <w:r>
+        <w:rPr>
+          <w:rFonts w:ascii="Calibri" w:cs="Calibri" w:eastAsia="Calibri" w:hAnsi="Calibri"/>
+        </w:rPr>
+        <w:t xml:space="preserve">.</w:t>
+      </w:r>
+    </w:p>
+    <w:p>
+      <w:pPr>
+        <w:keepNext w:val="false"/>
+        <w:spacing w:after="80" w:before="100" w:line="276"/>
+      </w:pPr>
+      <w:r>
+        <w:rPr>
+          <w:rFonts w:ascii="Calibri" w:cs="Calibri" w:eastAsia="Calibri" w:hAnsi="Calibri"/>
+          <w:b/>
+          <w:bCs/>
+          <w:color w:val="15803D"/>
+        </w:rPr>
+        <w:t xml:space="preserve">2.2  </w:t>
+      </w:r>
+      <w:r>
+        <w:rPr>
+          <w:rFonts w:ascii="Calibri" w:cs="Calibri" w:eastAsia="Calibri" w:hAnsi="Calibri"/>
+          <w:b/>
+          <w:bCs/>
+        </w:rPr>
+        <w:t xml:space="preserve">Leave every Build settings field empty</w:t>
+      </w:r>
+      <w:r>
+        <w:rPr>
+          <w:rFonts w:ascii="Calibri" w:cs="Calibri" w:eastAsia="Calibri" w:hAnsi="Calibri"/>
+        </w:rPr>
+        <w:t xml:space="preserve"> — Base directory, Build command, Publish directory and Functions directory. Their values come from </w:t>
+      </w:r>
+      <w:r>
+        <w:rPr>
+          <w:rFonts w:ascii="Consolas" w:cs="Consolas" w:eastAsia="Consolas" w:hAnsi="Consolas"/>
+          <w:color w:val="0F172A"/>
+          <w:sz w:val="20"/>
+          <w:szCs w:val="20"/>
+          <w:shd w:fill="F1F5F9" w:val="clear"/>
+        </w:rPr>
+        <w:t xml:space="preserve">netlify.toml</w:t>
+      </w:r>
+      <w:r>
+        <w:rPr>
+          <w:rFonts w:ascii="Calibri" w:cs="Calibri" w:eastAsia="Calibri" w:hAnsi="Calibri"/>
+        </w:rPr>
+        <w:t xml:space="preserve"> in the repository and take priority.</w:t>
+      </w:r>
+    </w:p>
+    <w:p>
+      <w:pPr>
+        <w:keepNext w:val="false"/>
+        <w:spacing w:after="80" w:before="100" w:line="276"/>
+      </w:pPr>
+      <w:r>
+        <w:rPr>
+          <w:rFonts w:ascii="Calibri" w:cs="Calibri" w:eastAsia="Calibri" w:hAnsi="Calibri"/>
+          <w:b/>
+          <w:bCs/>
+          <w:color w:val="15803D"/>
+        </w:rPr>
+        <w:t xml:space="preserve">2.3  </w:t>
+      </w:r>
+      <w:r>
+        <w:rPr>
+          <w:rFonts w:ascii="Calibri" w:cs="Calibri" w:eastAsia="Calibri" w:hAnsi="Calibri"/>
+        </w:rPr>
+        <w:t xml:space="preserve">Open </w:t>
+      </w:r>
+      <w:r>
+        <w:rPr>
+          <w:rFonts w:ascii="Calibri" w:cs="Calibri" w:eastAsia="Calibri" w:hAnsi="Calibri"/>
+          <w:b/>
+          <w:bCs/>
+        </w:rPr>
+        <w:t xml:space="preserve">Environment variables → Add environment variables</w:t>
+      </w:r>
+      <w:r>
+        <w:rPr>
+          <w:rFonts w:ascii="Calibri" w:cs="Calibri" w:eastAsia="Calibri" w:hAnsi="Calibri"/>
+        </w:rPr>
+        <w:t xml:space="preserve"> and add the values below. Mark the secrets as </w:t>
+      </w:r>
+      <w:r>
+        <w:rPr>
+          <w:rFonts w:ascii="Calibri" w:cs="Calibri" w:eastAsia="Calibri" w:hAnsi="Calibri"/>
+          <w:b/>
+          <w:bCs/>
+        </w:rPr>
+        <w:t xml:space="preserve">secret</w:t>
+      </w:r>
+      <w:r>
+        <w:rPr>
+          <w:rFonts w:ascii="Calibri" w:cs="Calibri" w:eastAsia="Calibri" w:hAnsi="Calibri"/>
+        </w:rPr>
+        <w:t xml:space="preserve">.</w:t>
       </w:r>
     </w:p>
     <w:tbl>
@@ -15248,7 +15031,8 @@
       </w:tblPr>
       <w:tblGrid>
         <w:gridCol w:w="3000"/>
-        <w:gridCol w:w="6026"/>
+        <w:gridCol w:w="4526"/>
+        <w:gridCol w:w="1500"/>
       </w:tblGrid>
       <w:tr>
         <w:trPr>
@@ -15291,7 +15075,7 @@
         </w:tc>
         <w:tc>
           <w:tcPr>
-            <w:tcW w:type="dxa" w:w="6026"/>
+            <w:tcW w:type="dxa" w:w="4526"/>
             <w:tcBorders>
               <w:top w:val="single" w:color="CBD5E1" w:sz="4"/>
               <w:left w:val="single" w:color="CBD5E1" w:sz="4"/>
@@ -15320,6 +15104,40 @@
                 <w:szCs w:val="20"/>
               </w:rPr>
               <w:t xml:space="preserve">Value</w:t>
+            </w:r>
+          </w:p>
+        </w:tc>
+        <w:tc>
+          <w:tcPr>
+            <w:tcW w:type="dxa" w:w="1500"/>
+            <w:tcBorders>
+              <w:top w:val="single" w:color="CBD5E1" w:sz="4"/>
+              <w:left w:val="single" w:color="CBD5E1" w:sz="4"/>
+              <w:bottom w:val="single" w:color="CBD5E1" w:sz="4"/>
+              <w:right w:val="single" w:color="CBD5E1" w:sz="4"/>
+            </w:tcBorders>
+            <w:shd w:fill="15803D" w:val="clear"/>
+            <w:tcMar>
+              <w:top w:type="dxa" w:w="70"/>
+              <w:left w:type="dxa" w:w="110"/>
+              <w:bottom w:type="dxa" w:w="70"/>
+              <w:right w:type="dxa" w:w="110"/>
+            </w:tcMar>
+          </w:tcPr>
+          <w:p>
+            <w:pPr>
+              <w:spacing w:after="20" w:line="250"/>
+            </w:pPr>
+            <w:r>
+              <w:rPr>
+                <w:rFonts w:ascii="Calibri" w:cs="Calibri" w:eastAsia="Calibri" w:hAnsi="Calibri"/>
+                <w:b/>
+                <w:bCs/>
+                <w:color w:val="FFFFFF"/>
+                <w:sz w:val="20"/>
+                <w:szCs w:val="20"/>
+              </w:rPr>
+              <w:t xml:space="preserve">Secret</w:t>
             </w:r>
           </w:p>
         </w:tc>
@@ -15356,37 +15174,37 @@
                 <w:szCs w:val="18"/>
                 <w:shd w:fill="F1F5F9" w:val="clear"/>
               </w:rPr>
-              <w:t xml:space="preserve">VITE_API_URL</w:t>
-            </w:r>
-          </w:p>
-        </w:tc>
-        <w:tc>
-          <w:tcPr>
-            <w:tcW w:type="dxa" w:w="6026"/>
-            <w:tcBorders>
-              <w:top w:val="single" w:color="CBD5E1" w:sz="4"/>
-              <w:left w:val="single" w:color="CBD5E1" w:sz="4"/>
-              <w:bottom w:val="single" w:color="CBD5E1" w:sz="4"/>
-              <w:right w:val="single" w:color="CBD5E1" w:sz="4"/>
-            </w:tcBorders>
-            <w:tcMar>
-              <w:top w:type="dxa" w:w="70"/>
-              <w:left w:type="dxa" w:w="110"/>
-              <w:bottom w:type="dxa" w:w="70"/>
-              <w:right w:type="dxa" w:w="110"/>
-            </w:tcMar>
-          </w:tcPr>
-          <w:p>
-            <w:pPr>
-              <w:spacing w:after="20" w:line="250"/>
-            </w:pPr>
-            <w:r>
-              <w:rPr>
-                <w:rFonts w:ascii="Calibri" w:cs="Calibri" w:eastAsia="Calibri" w:hAnsi="Calibri"/>
-                <w:sz w:val="20"/>
-                <w:szCs w:val="20"/>
-              </w:rPr>
-              <w:t xml:space="preserve">The API address </w:t>
+              <w:t xml:space="preserve">DATABASE_URL</w:t>
+            </w:r>
+          </w:p>
+        </w:tc>
+        <w:tc>
+          <w:tcPr>
+            <w:tcW w:type="dxa" w:w="4526"/>
+            <w:tcBorders>
+              <w:top w:val="single" w:color="CBD5E1" w:sz="4"/>
+              <w:left w:val="single" w:color="CBD5E1" w:sz="4"/>
+              <w:bottom w:val="single" w:color="CBD5E1" w:sz="4"/>
+              <w:right w:val="single" w:color="CBD5E1" w:sz="4"/>
+            </w:tcBorders>
+            <w:tcMar>
+              <w:top w:type="dxa" w:w="70"/>
+              <w:left w:type="dxa" w:w="110"/>
+              <w:bottom w:type="dxa" w:w="70"/>
+              <w:right w:type="dxa" w:w="110"/>
+            </w:tcMar>
+          </w:tcPr>
+          <w:p>
+            <w:pPr>
+              <w:spacing w:after="20" w:line="250"/>
+            </w:pPr>
+            <w:r>
+              <w:rPr>
+                <w:rFonts w:ascii="Calibri" w:cs="Calibri" w:eastAsia="Calibri" w:hAnsi="Calibri"/>
+                <w:sz w:val="20"/>
+                <w:szCs w:val="20"/>
+              </w:rPr>
+              <w:t xml:space="preserve">Supabase </w:t>
             </w:r>
             <w:r>
               <w:rPr>
@@ -15396,43 +15214,45 @@
                 <w:sz w:val="20"/>
                 <w:szCs w:val="20"/>
               </w:rPr>
-              <w:t xml:space="preserve">with</w:t>
-            </w:r>
-            <w:r>
-              <w:rPr>
-                <w:rFonts w:ascii="Calibri" w:cs="Calibri" w:eastAsia="Calibri" w:hAnsi="Calibri"/>
-                <w:sz w:val="20"/>
-                <w:szCs w:val="20"/>
-              </w:rPr>
-              <w:t xml:space="preserve"> the </w:t>
-            </w:r>
-            <w:r>
-              <w:rPr>
-                <w:rFonts w:ascii="Consolas" w:cs="Consolas" w:eastAsia="Consolas" w:hAnsi="Consolas"/>
-                <w:color w:val="0F172A"/>
-                <w:sz w:val="18"/>
-                <w:szCs w:val="18"/>
-                <w:shd w:fill="F1F5F9" w:val="clear"/>
-              </w:rPr>
-              <w:t xml:space="preserve">/api</w:t>
-            </w:r>
-            <w:r>
-              <w:rPr>
-                <w:rFonts w:ascii="Calibri" w:cs="Calibri" w:eastAsia="Calibri" w:hAnsi="Calibri"/>
-                <w:sz w:val="20"/>
-                <w:szCs w:val="20"/>
-              </w:rPr>
-              <w:t xml:space="preserve"> suffix, e.g. </w:t>
-            </w:r>
-            <w:r>
-              <w:rPr>
-                <w:rFonts w:ascii="Consolas" w:cs="Consolas" w:eastAsia="Consolas" w:hAnsi="Consolas"/>
-                <w:color w:val="0F172A"/>
-                <w:sz w:val="18"/>
-                <w:szCs w:val="18"/>
-                <w:shd w:fill="F1F5F9" w:val="clear"/>
-              </w:rPr>
-              <w:t xml:space="preserve">https://vijay-dairy-api.example.com/api</w:t>
+              <w:t xml:space="preserve">Transaction pooler</w:t>
+            </w:r>
+            <w:r>
+              <w:rPr>
+                <w:rFonts w:ascii="Calibri" w:cs="Calibri" w:eastAsia="Calibri" w:hAnsi="Calibri"/>
+                <w:sz w:val="20"/>
+                <w:szCs w:val="20"/>
+              </w:rPr>
+              <w:t xml:space="preserve"> URI (port 6543), password URL-encoded</w:t>
+            </w:r>
+          </w:p>
+        </w:tc>
+        <w:tc>
+          <w:tcPr>
+            <w:tcW w:type="dxa" w:w="1500"/>
+            <w:tcBorders>
+              <w:top w:val="single" w:color="CBD5E1" w:sz="4"/>
+              <w:left w:val="single" w:color="CBD5E1" w:sz="4"/>
+              <w:bottom w:val="single" w:color="CBD5E1" w:sz="4"/>
+              <w:right w:val="single" w:color="CBD5E1" w:sz="4"/>
+            </w:tcBorders>
+            <w:tcMar>
+              <w:top w:type="dxa" w:w="70"/>
+              <w:left w:type="dxa" w:w="110"/>
+              <w:bottom w:type="dxa" w:w="70"/>
+              <w:right w:type="dxa" w:w="110"/>
+            </w:tcMar>
+          </w:tcPr>
+          <w:p>
+            <w:pPr>
+              <w:spacing w:after="20" w:line="250"/>
+            </w:pPr>
+            <w:r>
+              <w:rPr>
+                <w:rFonts w:ascii="Calibri" w:cs="Calibri" w:eastAsia="Calibri" w:hAnsi="Calibri"/>
+                <w:sz w:val="20"/>
+                <w:szCs w:val="20"/>
+              </w:rPr>
+              <w:t xml:space="preserve">Yes</w:t>
             </w:r>
           </w:p>
         </w:tc>
@@ -15470,13 +15290,13 @@
                 <w:szCs w:val="18"/>
                 <w:shd w:fill="F1F5F9" w:val="clear"/>
               </w:rPr>
-              <w:t xml:space="preserve">VITE_SECURE_STORAGE_ACTIVE</w:t>
-            </w:r>
-          </w:p>
-        </w:tc>
-        <w:tc>
-          <w:tcPr>
-            <w:tcW w:type="dxa" w:w="6026"/>
+              <w:t xml:space="preserve">PG_POOL_MAX</w:t>
+            </w:r>
+          </w:p>
+        </w:tc>
+        <w:tc>
+          <w:tcPr>
+            <w:tcW w:type="dxa" w:w="4526"/>
             <w:tcBorders>
               <w:top w:val="single" w:color="CBD5E1" w:sz="4"/>
               <w:left w:val="single" w:color="CBD5E1" w:sz="4"/>
@@ -15503,7 +15323,46 @@
                 <w:szCs w:val="18"/>
                 <w:shd w:fill="F1F5F9" w:val="clear"/>
               </w:rPr>
-              <w:t xml:space="preserve">true</w:t>
+              <w:t xml:space="preserve">1</w:t>
+            </w:r>
+            <w:r>
+              <w:rPr>
+                <w:rFonts w:ascii="Calibri" w:cs="Calibri" w:eastAsia="Calibri" w:hAnsi="Calibri"/>
+                <w:sz w:val="20"/>
+                <w:szCs w:val="20"/>
+              </w:rPr>
+              <w:t xml:space="preserve"> (one database connection per function instance)</w:t>
+            </w:r>
+          </w:p>
+        </w:tc>
+        <w:tc>
+          <w:tcPr>
+            <w:tcW w:type="dxa" w:w="1500"/>
+            <w:tcBorders>
+              <w:top w:val="single" w:color="CBD5E1" w:sz="4"/>
+              <w:left w:val="single" w:color="CBD5E1" w:sz="4"/>
+              <w:bottom w:val="single" w:color="CBD5E1" w:sz="4"/>
+              <w:right w:val="single" w:color="CBD5E1" w:sz="4"/>
+            </w:tcBorders>
+            <w:shd w:fill="F8FAFC" w:val="clear"/>
+            <w:tcMar>
+              <w:top w:type="dxa" w:w="70"/>
+              <w:left w:type="dxa" w:w="110"/>
+              <w:bottom w:type="dxa" w:w="70"/>
+              <w:right w:type="dxa" w:w="110"/>
+            </w:tcMar>
+          </w:tcPr>
+          <w:p>
+            <w:pPr>
+              <w:spacing w:after="20" w:line="250"/>
+            </w:pPr>
+            <w:r>
+              <w:rPr>
+                <w:rFonts w:ascii="Calibri" w:cs="Calibri" w:eastAsia="Calibri" w:hAnsi="Calibri"/>
+                <w:sz w:val="20"/>
+                <w:szCs w:val="20"/>
+              </w:rPr>
+              <w:t xml:space="preserve">No</w:t>
             </w:r>
           </w:p>
         </w:tc>
@@ -15540,19 +15399,85 @@
                 <w:szCs w:val="18"/>
                 <w:shd w:fill="F1F5F9" w:val="clear"/>
               </w:rPr>
-              <w:t xml:space="preserve">NODE_VERSION</w:t>
-            </w:r>
-          </w:p>
-        </w:tc>
-        <w:tc>
-          <w:tcPr>
-            <w:tcW w:type="dxa" w:w="6026"/>
-            <w:tcBorders>
-              <w:top w:val="single" w:color="CBD5E1" w:sz="4"/>
-              <w:left w:val="single" w:color="CBD5E1" w:sz="4"/>
-              <w:bottom w:val="single" w:color="CBD5E1" w:sz="4"/>
-              <w:right w:val="single" w:color="CBD5E1" w:sz="4"/>
-            </w:tcBorders>
+              <w:t xml:space="preserve">JWT_SECRET</w:t>
+            </w:r>
+          </w:p>
+        </w:tc>
+        <w:tc>
+          <w:tcPr>
+            <w:tcW w:type="dxa" w:w="4526"/>
+            <w:tcBorders>
+              <w:top w:val="single" w:color="CBD5E1" w:sz="4"/>
+              <w:left w:val="single" w:color="CBD5E1" w:sz="4"/>
+              <w:bottom w:val="single" w:color="CBD5E1" w:sz="4"/>
+              <w:right w:val="single" w:color="CBD5E1" w:sz="4"/>
+            </w:tcBorders>
+            <w:tcMar>
+              <w:top w:type="dxa" w:w="70"/>
+              <w:left w:type="dxa" w:w="110"/>
+              <w:bottom w:type="dxa" w:w="70"/>
+              <w:right w:type="dxa" w:w="110"/>
+            </w:tcMar>
+          </w:tcPr>
+          <w:p>
+            <w:pPr>
+              <w:spacing w:after="20" w:line="250"/>
+            </w:pPr>
+            <w:r>
+              <w:rPr>
+                <w:rFonts w:ascii="Calibri" w:cs="Calibri" w:eastAsia="Calibri" w:hAnsi="Calibri"/>
+                <w:sz w:val="20"/>
+                <w:szCs w:val="20"/>
+              </w:rPr>
+              <w:t xml:space="preserve">48+ random bytes (Step C3 command in Part C)</w:t>
+            </w:r>
+          </w:p>
+        </w:tc>
+        <w:tc>
+          <w:tcPr>
+            <w:tcW w:type="dxa" w:w="1500"/>
+            <w:tcBorders>
+              <w:top w:val="single" w:color="CBD5E1" w:sz="4"/>
+              <w:left w:val="single" w:color="CBD5E1" w:sz="4"/>
+              <w:bottom w:val="single" w:color="CBD5E1" w:sz="4"/>
+              <w:right w:val="single" w:color="CBD5E1" w:sz="4"/>
+            </w:tcBorders>
+            <w:tcMar>
+              <w:top w:type="dxa" w:w="70"/>
+              <w:left w:type="dxa" w:w="110"/>
+              <w:bottom w:type="dxa" w:w="70"/>
+              <w:right w:type="dxa" w:w="110"/>
+            </w:tcMar>
+          </w:tcPr>
+          <w:p>
+            <w:pPr>
+              <w:spacing w:after="20" w:line="250"/>
+            </w:pPr>
+            <w:r>
+              <w:rPr>
+                <w:rFonts w:ascii="Calibri" w:cs="Calibri" w:eastAsia="Calibri" w:hAnsi="Calibri"/>
+                <w:sz w:val="20"/>
+                <w:szCs w:val="20"/>
+              </w:rPr>
+              <w:t xml:space="preserve">Yes</w:t>
+            </w:r>
+          </w:p>
+        </w:tc>
+      </w:tr>
+      <w:tr>
+        <w:trPr>
+          <w:cantSplit/>
+        </w:trPr>
+        <w:tc>
+          <w:tcPr>
+            <w:tcW w:type="dxa" w:w="3000"/>
+            <w:tcBorders>
+              <w:top w:val="single" w:color="CBD5E1" w:sz="4"/>
+              <w:left w:val="single" w:color="CBD5E1" w:sz="4"/>
+              <w:bottom w:val="single" w:color="CBD5E1" w:sz="4"/>
+              <w:right w:val="single" w:color="CBD5E1" w:sz="4"/>
+            </w:tcBorders>
+            <w:shd w:fill="F8FAFC" w:val="clear"/>
             <w:tcMar>
               <w:top w:type="dxa" w:w="70"/>
               <w:left w:type="dxa" w:w="110"/>
@@ -15572,7 +15497,503 @@
                 <w:szCs w:val="18"/>
                 <w:shd w:fill="F1F5F9" w:val="clear"/>
               </w:rPr>
-              <w:t xml:space="preserve">22</w:t>
+              <w:t xml:space="preserve">ADMIN_EMAIL</w:t>
+            </w:r>
+          </w:p>
+        </w:tc>
+        <w:tc>
+          <w:tcPr>
+            <w:tcW w:type="dxa" w:w="4526"/>
+            <w:tcBorders>
+              <w:top w:val="single" w:color="CBD5E1" w:sz="4"/>
+              <w:left w:val="single" w:color="CBD5E1" w:sz="4"/>
+              <w:bottom w:val="single" w:color="CBD5E1" w:sz="4"/>
+              <w:right w:val="single" w:color="CBD5E1" w:sz="4"/>
+            </w:tcBorders>
+            <w:shd w:fill="F8FAFC" w:val="clear"/>
+            <w:tcMar>
+              <w:top w:type="dxa" w:w="70"/>
+              <w:left w:type="dxa" w:w="110"/>
+              <w:bottom w:type="dxa" w:w="70"/>
+              <w:right w:type="dxa" w:w="110"/>
+            </w:tcMar>
+          </w:tcPr>
+          <w:p>
+            <w:pPr>
+              <w:spacing w:after="20" w:line="250"/>
+            </w:pPr>
+            <w:r>
+              <w:rPr>
+                <w:rFonts w:ascii="Calibri" w:cs="Calibri" w:eastAsia="Calibri" w:hAnsi="Calibri"/>
+                <w:sz w:val="20"/>
+                <w:szCs w:val="20"/>
+              </w:rPr>
+              <w:t xml:space="preserve">Administrator sign-in e-mail</w:t>
+            </w:r>
+          </w:p>
+        </w:tc>
+        <w:tc>
+          <w:tcPr>
+            <w:tcW w:type="dxa" w:w="1500"/>
+            <w:tcBorders>
+              <w:top w:val="single" w:color="CBD5E1" w:sz="4"/>
+              <w:left w:val="single" w:color="CBD5E1" w:sz="4"/>
+              <w:bottom w:val="single" w:color="CBD5E1" w:sz="4"/>
+              <w:right w:val="single" w:color="CBD5E1" w:sz="4"/>
+            </w:tcBorders>
+            <w:shd w:fill="F8FAFC" w:val="clear"/>
+            <w:tcMar>
+              <w:top w:type="dxa" w:w="70"/>
+              <w:left w:type="dxa" w:w="110"/>
+              <w:bottom w:type="dxa" w:w="70"/>
+              <w:right w:type="dxa" w:w="110"/>
+            </w:tcMar>
+          </w:tcPr>
+          <w:p>
+            <w:pPr>
+              <w:spacing w:after="20" w:line="250"/>
+            </w:pPr>
+            <w:r>
+              <w:rPr>
+                <w:rFonts w:ascii="Calibri" w:cs="Calibri" w:eastAsia="Calibri" w:hAnsi="Calibri"/>
+                <w:sz w:val="20"/>
+                <w:szCs w:val="20"/>
+              </w:rPr>
+              <w:t xml:space="preserve">No</w:t>
+            </w:r>
+          </w:p>
+        </w:tc>
+      </w:tr>
+      <w:tr>
+        <w:trPr>
+          <w:cantSplit/>
+        </w:trPr>
+        <w:tc>
+          <w:tcPr>
+            <w:tcW w:type="dxa" w:w="3000"/>
+            <w:tcBorders>
+              <w:top w:val="single" w:color="CBD5E1" w:sz="4"/>
+              <w:left w:val="single" w:color="CBD5E1" w:sz="4"/>
+              <w:bottom w:val="single" w:color="CBD5E1" w:sz="4"/>
+              <w:right w:val="single" w:color="CBD5E1" w:sz="4"/>
+            </w:tcBorders>
+            <w:tcMar>
+              <w:top w:type="dxa" w:w="70"/>
+              <w:left w:type="dxa" w:w="110"/>
+              <w:bottom w:type="dxa" w:w="70"/>
+              <w:right w:type="dxa" w:w="110"/>
+            </w:tcMar>
+          </w:tcPr>
+          <w:p>
+            <w:pPr>
+              <w:spacing w:after="20" w:line="250"/>
+            </w:pPr>
+            <w:r>
+              <w:rPr>
+                <w:rFonts w:ascii="Consolas" w:cs="Consolas" w:eastAsia="Consolas" w:hAnsi="Consolas"/>
+                <w:color w:val="0F172A"/>
+                <w:sz w:val="18"/>
+                <w:szCs w:val="18"/>
+                <w:shd w:fill="F1F5F9" w:val="clear"/>
+              </w:rPr>
+              <w:t xml:space="preserve">ADMIN_PASSWORD</w:t>
+            </w:r>
+          </w:p>
+        </w:tc>
+        <w:tc>
+          <w:tcPr>
+            <w:tcW w:type="dxa" w:w="4526"/>
+            <w:tcBorders>
+              <w:top w:val="single" w:color="CBD5E1" w:sz="4"/>
+              <w:left w:val="single" w:color="CBD5E1" w:sz="4"/>
+              <w:bottom w:val="single" w:color="CBD5E1" w:sz="4"/>
+              <w:right w:val="single" w:color="CBD5E1" w:sz="4"/>
+            </w:tcBorders>
+            <w:tcMar>
+              <w:top w:type="dxa" w:w="70"/>
+              <w:left w:type="dxa" w:w="110"/>
+              <w:bottom w:type="dxa" w:w="70"/>
+              <w:right w:type="dxa" w:w="110"/>
+            </w:tcMar>
+          </w:tcPr>
+          <w:p>
+            <w:pPr>
+              <w:spacing w:after="20" w:line="250"/>
+            </w:pPr>
+            <w:r>
+              <w:rPr>
+                <w:rFonts w:ascii="Calibri" w:cs="Calibri" w:eastAsia="Calibri" w:hAnsi="Calibri"/>
+                <w:sz w:val="20"/>
+                <w:szCs w:val="20"/>
+              </w:rPr>
+              <w:t xml:space="preserve">Strong password for the first admin</w:t>
+            </w:r>
+          </w:p>
+        </w:tc>
+        <w:tc>
+          <w:tcPr>
+            <w:tcW w:type="dxa" w:w="1500"/>
+            <w:tcBorders>
+              <w:top w:val="single" w:color="CBD5E1" w:sz="4"/>
+              <w:left w:val="single" w:color="CBD5E1" w:sz="4"/>
+              <w:bottom w:val="single" w:color="CBD5E1" w:sz="4"/>
+              <w:right w:val="single" w:color="CBD5E1" w:sz="4"/>
+            </w:tcBorders>
+            <w:tcMar>
+              <w:top w:type="dxa" w:w="70"/>
+              <w:left w:type="dxa" w:w="110"/>
+              <w:bottom w:type="dxa" w:w="70"/>
+              <w:right w:type="dxa" w:w="110"/>
+            </w:tcMar>
+          </w:tcPr>
+          <w:p>
+            <w:pPr>
+              <w:spacing w:after="20" w:line="250"/>
+            </w:pPr>
+            <w:r>
+              <w:rPr>
+                <w:rFonts w:ascii="Calibri" w:cs="Calibri" w:eastAsia="Calibri" w:hAnsi="Calibri"/>
+                <w:sz w:val="20"/>
+                <w:szCs w:val="20"/>
+              </w:rPr>
+              <w:t xml:space="preserve">Yes</w:t>
+            </w:r>
+          </w:p>
+        </w:tc>
+      </w:tr>
+      <w:tr>
+        <w:trPr>
+          <w:cantSplit/>
+        </w:trPr>
+        <w:tc>
+          <w:tcPr>
+            <w:tcW w:type="dxa" w:w="3000"/>
+            <w:tcBorders>
+              <w:top w:val="single" w:color="CBD5E1" w:sz="4"/>
+              <w:left w:val="single" w:color="CBD5E1" w:sz="4"/>
+              <w:bottom w:val="single" w:color="CBD5E1" w:sz="4"/>
+              <w:right w:val="single" w:color="CBD5E1" w:sz="4"/>
+            </w:tcBorders>
+            <w:shd w:fill="F8FAFC" w:val="clear"/>
+            <w:tcMar>
+              <w:top w:type="dxa" w:w="70"/>
+              <w:left w:type="dxa" w:w="110"/>
+              <w:bottom w:type="dxa" w:w="70"/>
+              <w:right w:type="dxa" w:w="110"/>
+            </w:tcMar>
+          </w:tcPr>
+          <w:p>
+            <w:pPr>
+              <w:spacing w:after="20" w:line="250"/>
+            </w:pPr>
+            <w:r>
+              <w:rPr>
+                <w:rFonts w:ascii="Consolas" w:cs="Consolas" w:eastAsia="Consolas" w:hAnsi="Consolas"/>
+                <w:color w:val="0F172A"/>
+                <w:sz w:val="18"/>
+                <w:szCs w:val="18"/>
+                <w:shd w:fill="F1F5F9" w:val="clear"/>
+              </w:rPr>
+              <w:t xml:space="preserve">JWT_ISSUER</w:t>
+            </w:r>
+            <w:r>
+              <w:rPr>
+                <w:rFonts w:ascii="Calibri" w:cs="Calibri" w:eastAsia="Calibri" w:hAnsi="Calibri"/>
+                <w:sz w:val="20"/>
+                <w:szCs w:val="20"/>
+              </w:rPr>
+              <w:t xml:space="preserve">, </w:t>
+            </w:r>
+            <w:r>
+              <w:rPr>
+                <w:rFonts w:ascii="Consolas" w:cs="Consolas" w:eastAsia="Consolas" w:hAnsi="Consolas"/>
+                <w:color w:val="0F172A"/>
+                <w:sz w:val="18"/>
+                <w:szCs w:val="18"/>
+                <w:shd w:fill="F1F5F9" w:val="clear"/>
+              </w:rPr>
+              <w:t xml:space="preserve">JWT_AUDIENCE</w:t>
+            </w:r>
+            <w:r>
+              <w:rPr>
+                <w:rFonts w:ascii="Calibri" w:cs="Calibri" w:eastAsia="Calibri" w:hAnsi="Calibri"/>
+                <w:sz w:val="20"/>
+                <w:szCs w:val="20"/>
+              </w:rPr>
+              <w:t xml:space="preserve">, </w:t>
+            </w:r>
+            <w:r>
+              <w:rPr>
+                <w:rFonts w:ascii="Consolas" w:cs="Consolas" w:eastAsia="Consolas" w:hAnsi="Consolas"/>
+                <w:color w:val="0F172A"/>
+                <w:sz w:val="18"/>
+                <w:szCs w:val="18"/>
+                <w:shd w:fill="F1F5F9" w:val="clear"/>
+              </w:rPr>
+              <w:t xml:space="preserve">ADMIN_NAME</w:t>
+            </w:r>
+          </w:p>
+        </w:tc>
+        <w:tc>
+          <w:tcPr>
+            <w:tcW w:type="dxa" w:w="4526"/>
+            <w:tcBorders>
+              <w:top w:val="single" w:color="CBD5E1" w:sz="4"/>
+              <w:left w:val="single" w:color="CBD5E1" w:sz="4"/>
+              <w:bottom w:val="single" w:color="CBD5E1" w:sz="4"/>
+              <w:right w:val="single" w:color="CBD5E1" w:sz="4"/>
+            </w:tcBorders>
+            <w:shd w:fill="F8FAFC" w:val="clear"/>
+            <w:tcMar>
+              <w:top w:type="dxa" w:w="70"/>
+              <w:left w:type="dxa" w:w="110"/>
+              <w:bottom w:type="dxa" w:w="70"/>
+              <w:right w:type="dxa" w:w="110"/>
+            </w:tcMar>
+          </w:tcPr>
+          <w:p>
+            <w:pPr>
+              <w:spacing w:after="20" w:line="250"/>
+            </w:pPr>
+            <w:r>
+              <w:rPr>
+                <w:rFonts w:ascii="Calibri" w:cs="Calibri" w:eastAsia="Calibri" w:hAnsi="Calibri"/>
+                <w:sz w:val="20"/>
+                <w:szCs w:val="20"/>
+              </w:rPr>
+              <w:t xml:space="preserve">Optional — defaults are fine</w:t>
+            </w:r>
+          </w:p>
+        </w:tc>
+        <w:tc>
+          <w:tcPr>
+            <w:tcW w:type="dxa" w:w="1500"/>
+            <w:tcBorders>
+              <w:top w:val="single" w:color="CBD5E1" w:sz="4"/>
+              <w:left w:val="single" w:color="CBD5E1" w:sz="4"/>
+              <w:bottom w:val="single" w:color="CBD5E1" w:sz="4"/>
+              <w:right w:val="single" w:color="CBD5E1" w:sz="4"/>
+            </w:tcBorders>
+            <w:shd w:fill="F8FAFC" w:val="clear"/>
+            <w:tcMar>
+              <w:top w:type="dxa" w:w="70"/>
+              <w:left w:type="dxa" w:w="110"/>
+              <w:bottom w:type="dxa" w:w="70"/>
+              <w:right w:type="dxa" w:w="110"/>
+            </w:tcMar>
+          </w:tcPr>
+          <w:p>
+            <w:pPr>
+              <w:spacing w:after="20" w:line="250"/>
+            </w:pPr>
+            <w:r>
+              <w:rPr>
+                <w:rFonts w:ascii="Calibri" w:cs="Calibri" w:eastAsia="Calibri" w:hAnsi="Calibri"/>
+                <w:sz w:val="20"/>
+                <w:szCs w:val="20"/>
+              </w:rPr>
+              <w:t xml:space="preserve">No</w:t>
+            </w:r>
+          </w:p>
+        </w:tc>
+      </w:tr>
+      <w:tr>
+        <w:trPr>
+          <w:cantSplit/>
+        </w:trPr>
+        <w:tc>
+          <w:tcPr>
+            <w:tcW w:type="dxa" w:w="3000"/>
+            <w:tcBorders>
+              <w:top w:val="single" w:color="CBD5E1" w:sz="4"/>
+              <w:left w:val="single" w:color="CBD5E1" w:sz="4"/>
+              <w:bottom w:val="single" w:color="CBD5E1" w:sz="4"/>
+              <w:right w:val="single" w:color="CBD5E1" w:sz="4"/>
+            </w:tcBorders>
+            <w:tcMar>
+              <w:top w:type="dxa" w:w="70"/>
+              <w:left w:type="dxa" w:w="110"/>
+              <w:bottom w:type="dxa" w:w="70"/>
+              <w:right w:type="dxa" w:w="110"/>
+            </w:tcMar>
+          </w:tcPr>
+          <w:p>
+            <w:pPr>
+              <w:spacing w:after="20" w:line="250"/>
+            </w:pPr>
+            <w:r>
+              <w:rPr>
+                <w:rFonts w:ascii="Consolas" w:cs="Consolas" w:eastAsia="Consolas" w:hAnsi="Consolas"/>
+                <w:color w:val="0F172A"/>
+                <w:sz w:val="18"/>
+                <w:szCs w:val="18"/>
+                <w:shd w:fill="F1F5F9" w:val="clear"/>
+              </w:rPr>
+              <w:t xml:space="preserve">VITE_API_URL</w:t>
+            </w:r>
+          </w:p>
+        </w:tc>
+        <w:tc>
+          <w:tcPr>
+            <w:tcW w:type="dxa" w:w="4526"/>
+            <w:tcBorders>
+              <w:top w:val="single" w:color="CBD5E1" w:sz="4"/>
+              <w:left w:val="single" w:color="CBD5E1" w:sz="4"/>
+              <w:bottom w:val="single" w:color="CBD5E1" w:sz="4"/>
+              <w:right w:val="single" w:color="CBD5E1" w:sz="4"/>
+            </w:tcBorders>
+            <w:tcMar>
+              <w:top w:type="dxa" w:w="70"/>
+              <w:left w:type="dxa" w:w="110"/>
+              <w:bottom w:type="dxa" w:w="70"/>
+              <w:right w:type="dxa" w:w="110"/>
+            </w:tcMar>
+          </w:tcPr>
+          <w:p>
+            <w:pPr>
+              <w:spacing w:after="20" w:line="250"/>
+            </w:pPr>
+            <w:r>
+              <w:rPr>
+                <w:rFonts w:ascii="Consolas" w:cs="Consolas" w:eastAsia="Consolas" w:hAnsi="Consolas"/>
+                <w:color w:val="0F172A"/>
+                <w:sz w:val="18"/>
+                <w:szCs w:val="18"/>
+                <w:shd w:fill="F1F5F9" w:val="clear"/>
+              </w:rPr>
+              <w:t xml:space="preserve">/api</w:t>
+            </w:r>
+          </w:p>
+        </w:tc>
+        <w:tc>
+          <w:tcPr>
+            <w:tcW w:type="dxa" w:w="1500"/>
+            <w:tcBorders>
+              <w:top w:val="single" w:color="CBD5E1" w:sz="4"/>
+              <w:left w:val="single" w:color="CBD5E1" w:sz="4"/>
+              <w:bottom w:val="single" w:color="CBD5E1" w:sz="4"/>
+              <w:right w:val="single" w:color="CBD5E1" w:sz="4"/>
+            </w:tcBorders>
+            <w:tcMar>
+              <w:top w:type="dxa" w:w="70"/>
+              <w:left w:type="dxa" w:w="110"/>
+              <w:bottom w:type="dxa" w:w="70"/>
+              <w:right w:type="dxa" w:w="110"/>
+            </w:tcMar>
+          </w:tcPr>
+          <w:p>
+            <w:pPr>
+              <w:spacing w:after="20" w:line="250"/>
+            </w:pPr>
+            <w:r>
+              <w:rPr>
+                <w:rFonts w:ascii="Calibri" w:cs="Calibri" w:eastAsia="Calibri" w:hAnsi="Calibri"/>
+                <w:sz w:val="20"/>
+                <w:szCs w:val="20"/>
+              </w:rPr>
+              <w:t xml:space="preserve">No — this is baked into the public bundle</w:t>
+            </w:r>
+          </w:p>
+        </w:tc>
+      </w:tr>
+      <w:tr>
+        <w:trPr>
+          <w:cantSplit/>
+        </w:trPr>
+        <w:tc>
+          <w:tcPr>
+            <w:tcW w:type="dxa" w:w="3000"/>
+            <w:tcBorders>
+              <w:top w:val="single" w:color="CBD5E1" w:sz="4"/>
+              <w:left w:val="single" w:color="CBD5E1" w:sz="4"/>
+              <w:bottom w:val="single" w:color="CBD5E1" w:sz="4"/>
+              <w:right w:val="single" w:color="CBD5E1" w:sz="4"/>
+            </w:tcBorders>
+            <w:shd w:fill="F8FAFC" w:val="clear"/>
+            <w:tcMar>
+              <w:top w:type="dxa" w:w="70"/>
+              <w:left w:type="dxa" w:w="110"/>
+              <w:bottom w:type="dxa" w:w="70"/>
+              <w:right w:type="dxa" w:w="110"/>
+            </w:tcMar>
+          </w:tcPr>
+          <w:p>
+            <w:pPr>
+              <w:spacing w:after="20" w:line="250"/>
+            </w:pPr>
+            <w:r>
+              <w:rPr>
+                <w:rFonts w:ascii="Consolas" w:cs="Consolas" w:eastAsia="Consolas" w:hAnsi="Consolas"/>
+                <w:color w:val="0F172A"/>
+                <w:sz w:val="18"/>
+                <w:szCs w:val="18"/>
+                <w:shd w:fill="F1F5F9" w:val="clear"/>
+              </w:rPr>
+              <w:t xml:space="preserve">VITE_SECURE_STORAGE_ACTIVE</w:t>
+            </w:r>
+          </w:p>
+        </w:tc>
+        <w:tc>
+          <w:tcPr>
+            <w:tcW w:type="dxa" w:w="4526"/>
+            <w:tcBorders>
+              <w:top w:val="single" w:color="CBD5E1" w:sz="4"/>
+              <w:left w:val="single" w:color="CBD5E1" w:sz="4"/>
+              <w:bottom w:val="single" w:color="CBD5E1" w:sz="4"/>
+              <w:right w:val="single" w:color="CBD5E1" w:sz="4"/>
+            </w:tcBorders>
+            <w:shd w:fill="F8FAFC" w:val="clear"/>
+            <w:tcMar>
+              <w:top w:type="dxa" w:w="70"/>
+              <w:left w:type="dxa" w:w="110"/>
+              <w:bottom w:type="dxa" w:w="70"/>
+              <w:right w:type="dxa" w:w="110"/>
+            </w:tcMar>
+          </w:tcPr>
+          <w:p>
+            <w:pPr>
+              <w:spacing w:after="20" w:line="250"/>
+            </w:pPr>
+            <w:r>
+              <w:rPr>
+                <w:rFonts w:ascii="Consolas" w:cs="Consolas" w:eastAsia="Consolas" w:hAnsi="Consolas"/>
+                <w:color w:val="0F172A"/>
+                <w:sz w:val="18"/>
+                <w:szCs w:val="18"/>
+                <w:shd w:fill="F1F5F9" w:val="clear"/>
+              </w:rPr>
+              <w:t xml:space="preserve">true</w:t>
+            </w:r>
+          </w:p>
+        </w:tc>
+        <w:tc>
+          <w:tcPr>
+            <w:tcW w:type="dxa" w:w="1500"/>
+            <w:tcBorders>
+              <w:top w:val="single" w:color="CBD5E1" w:sz="4"/>
+              <w:left w:val="single" w:color="CBD5E1" w:sz="4"/>
+              <w:bottom w:val="single" w:color="CBD5E1" w:sz="4"/>
+              <w:right w:val="single" w:color="CBD5E1" w:sz="4"/>
+            </w:tcBorders>
+            <w:shd w:fill="F8FAFC" w:val="clear"/>
+            <w:tcMar>
+              <w:top w:type="dxa" w:w="70"/>
+              <w:left w:type="dxa" w:w="110"/>
+              <w:bottom w:type="dxa" w:w="70"/>
+              <w:right w:type="dxa" w:w="110"/>
+            </w:tcMar>
+          </w:tcPr>
+          <w:p>
+            <w:pPr>
+              <w:spacing w:after="20" w:line="250"/>
+            </w:pPr>
+            <w:r>
+              <w:rPr>
+                <w:rFonts w:ascii="Calibri" w:cs="Calibri" w:eastAsia="Calibri" w:hAnsi="Calibri"/>
+                <w:sz w:val="20"/>
+                <w:szCs w:val="20"/>
+              </w:rPr>
+              <w:t xml:space="preserve">No</w:t>
             </w:r>
           </w:p>
         </w:tc>
@@ -15607,11 +16028,11 @@
             <w:tcW w:type="dxa" w:w="9026"/>
             <w:tcBorders>
               <w:top w:val="none" w:color="FFFFFF" w:sz="0"/>
-              <w:left w:val="single" w:color="D97706" w:sz="24"/>
+              <w:left w:val="single" w:color="DC2626" w:sz="24"/>
               <w:bottom w:val="none" w:color="FFFFFF" w:sz="0"/>
               <w:right w:val="none" w:color="FFFFFF" w:sz="0"/>
             </w:tcBorders>
-            <w:shd w:fill="FFFBEB" w:val="clear"/>
+            <w:shd w:fill="FEF2F2" w:val="clear"/>
             <w:tcMar>
               <w:top w:type="dxa" w:w="100"/>
               <w:left w:type="dxa" w:w="180"/>
@@ -15628,11 +16049,11 @@
                 <w:rFonts w:ascii="Calibri" w:cs="Calibri" w:eastAsia="Calibri" w:hAnsi="Calibri"/>
                 <w:b/>
                 <w:bCs/>
-                <w:color w:val="D97706"/>
-                <w:sz w:val="20"/>
-                <w:szCs w:val="20"/>
-              </w:rPr>
-              <w:t xml:space="preserve">IMPORTANT — Single-page-app redirect</w:t>
+                <w:color w:val="DC2626"/>
+                <w:sz w:val="20"/>
+                <w:szCs w:val="20"/>
+              </w:rPr>
+              <w:t xml:space="preserve">SECURITY — Never use VITE_</w:t>
             </w:r>
           </w:p>
           <w:p>
@@ -15645,7 +16066,7 @@
                 <w:sz w:val="21"/>
                 <w:szCs w:val="21"/>
               </w:rPr>
-              <w:t xml:space="preserve">The file </w:t>
+              <w:t xml:space="preserve">Anything named </w:t>
             </w:r>
             <w:r>
               <w:rPr>
@@ -15655,7 +16076,7 @@
                 <w:szCs w:val="19"/>
                 <w:shd w:fill="F1F5F9" w:val="clear"/>
               </w:rPr>
-              <w:t xml:space="preserve">Frontend/public/_redirects</w:t>
+              <w:t xml:space="preserve">VITE_*</w:t>
             </w:r>
             <w:r>
               <w:rPr>
@@ -15663,7 +16084,7 @@
                 <w:sz w:val="21"/>
                 <w:szCs w:val="21"/>
               </w:rPr>
-              <w:t xml:space="preserve"> (</w:t>
+              <w:t xml:space="preserve"> is copied into the public JavaScript bundle and can be read by every visitor. Keep </w:t>
             </w:r>
             <w:r>
               <w:rPr>
@@ -15673,7 +16094,7 @@
                 <w:szCs w:val="19"/>
                 <w:shd w:fill="F1F5F9" w:val="clear"/>
               </w:rPr>
-              <w:t xml:space="preserve">/*  /index.html  200</w:t>
+              <w:t xml:space="preserve">DATABASE_URL</w:t>
             </w:r>
             <w:r>
               <w:rPr>
@@ -15681,7 +16102,7 @@
                 <w:sz w:val="21"/>
                 <w:szCs w:val="21"/>
               </w:rPr>
-              <w:t xml:space="preserve">) is copied into the build and makes Netlify return </w:t>
+              <w:t xml:space="preserve">, </w:t>
             </w:r>
             <w:r>
               <w:rPr>
@@ -15691,7 +16112,7 @@
                 <w:szCs w:val="19"/>
                 <w:shd w:fill="F1F5F9" w:val="clear"/>
               </w:rPr>
-              <w:t xml:space="preserve">index.html</w:t>
+              <w:t xml:space="preserve">JWT_SECRET</w:t>
             </w:r>
             <w:r>
               <w:rPr>
@@ -15699,7 +16120,7 @@
                 <w:sz w:val="21"/>
                 <w:szCs w:val="21"/>
               </w:rPr>
-              <w:t xml:space="preserve"> for every path. Without it, page refreshes and public invoice links (</w:t>
+              <w:t xml:space="preserve"> and </w:t>
             </w:r>
             <w:r>
               <w:rPr>
@@ -15709,7 +16130,7 @@
                 <w:szCs w:val="19"/>
                 <w:shd w:fill="F1F5F9" w:val="clear"/>
               </w:rPr>
-              <w:t xml:space="preserve">/invoice/&lt;id&gt;</w:t>
+              <w:t xml:space="preserve">ADMIN_PASSWORD</w:t>
             </w:r>
             <w:r>
               <w:rPr>
@@ -15717,93 +16138,7 @@
                 <w:sz w:val="21"/>
                 <w:szCs w:val="21"/>
               </w:rPr>
-              <w:t xml:space="preserve">) return 404.</w:t>
-            </w:r>
-          </w:p>
-        </w:tc>
-      </w:tr>
-    </w:tbl>
-    <w:tbl>
-      <w:tblPr>
-        <w:tblW w:type="dxa" w:w="9026"/>
-        <w:tblBorders>
-          <w:top w:val="single" w:color="auto" w:sz="4"/>
-          <w:left w:val="single" w:color="auto" w:sz="4"/>
-          <w:bottom w:val="single" w:color="auto" w:sz="4"/>
-          <w:right w:val="single" w:color="auto" w:sz="4"/>
-          <w:insideH w:val="single" w:color="auto" w:sz="4"/>
-          <w:insideV w:val="single" w:color="auto" w:sz="4"/>
-        </w:tblBorders>
-      </w:tblPr>
-      <w:tblGrid>
-        <w:gridCol w:w="9026"/>
-      </w:tblGrid>
-      <w:tr>
-        <w:trPr>
-          <w:cantSplit/>
-        </w:trPr>
-        <w:tc>
-          <w:tcPr>
-            <w:tcW w:type="dxa" w:w="9026"/>
-            <w:tcBorders>
-              <w:top w:val="none" w:color="FFFFFF" w:sz="0"/>
-              <w:left w:val="single" w:color="2563EB" w:sz="24"/>
-              <w:bottom w:val="none" w:color="FFFFFF" w:sz="0"/>
-              <w:right w:val="none" w:color="FFFFFF" w:sz="0"/>
-            </w:tcBorders>
-            <w:shd w:fill="EFF6FF" w:val="clear"/>
-            <w:tcMar>
-              <w:top w:type="dxa" w:w="100"/>
-              <w:left w:type="dxa" w:w="180"/>
-              <w:bottom w:type="dxa" w:w="100"/>
-              <w:right w:type="dxa" w:w="160"/>
-            </w:tcMar>
-          </w:tcPr>
-          <w:p>
-            <w:pPr>
-              <w:spacing w:after="40"/>
-            </w:pPr>
-            <w:r>
-              <w:rPr>
-                <w:rFonts w:ascii="Calibri" w:cs="Calibri" w:eastAsia="Calibri" w:hAnsi="Calibri"/>
-                <w:b/>
-                <w:bCs/>
-                <w:color w:val="2563EB"/>
-                <w:sz w:val="20"/>
-                <w:szCs w:val="20"/>
-              </w:rPr>
-              <w:t xml:space="preserve">NOTE — Repository</w:t>
-            </w:r>
-          </w:p>
-          <w:p>
-            <w:pPr>
-              <w:spacing w:after="0" w:line="264"/>
-            </w:pPr>
-            <w:r>
-              <w:rPr>
-                <w:rFonts w:ascii="Calibri" w:cs="Calibri" w:eastAsia="Calibri" w:hAnsi="Calibri"/>
-                <w:sz w:val="21"/>
-                <w:szCs w:val="21"/>
-              </w:rPr>
-              <w:t xml:space="preserve">Netlify builds from the Git repository, so the </w:t>
-            </w:r>
-            <w:r>
-              <w:rPr>
-                <w:rFonts w:ascii="Consolas" w:cs="Consolas" w:eastAsia="Consolas" w:hAnsi="Consolas"/>
-                <w:color w:val="0F172A"/>
-                <w:sz w:val="19"/>
-                <w:szCs w:val="19"/>
-                <w:shd w:fill="F1F5F9" w:val="clear"/>
-              </w:rPr>
-              <w:t xml:space="preserve">Frontend</w:t>
-            </w:r>
-            <w:r>
-              <w:rPr>
-                <w:rFonts w:ascii="Calibri" w:cs="Calibri" w:eastAsia="Calibri" w:hAnsi="Calibri"/>
-                <w:sz w:val="21"/>
-                <w:szCs w:val="21"/>
-              </w:rPr>
-              <w:t xml:space="preserve"> folder must be committed and pushed to it (it must not be a separate nested repository).</w:t>
+              <w:t xml:space="preserve"> without that prefix.</w:t>
             </w:r>
           </w:p>
         </w:tc>
@@ -15811,14 +16146,66 @@
     </w:tbl>
     <w:p>
       <w:pPr>
-        <w:spacing w:after="120" w:line="276"/>
+        <w:keepNext w:val="false"/>
+        <w:spacing w:after="80" w:before="100" w:line="276"/>
       </w:pPr>
       <w:r>
         <w:rPr>
           <w:rFonts w:ascii="Calibri" w:cs="Calibri" w:eastAsia="Calibri" w:hAnsi="Calibri"/>
-        </w:rPr>
-        <w:t xml:space="preserve">After the first deploy, add the final Netlify address to </w:t>
-      </w:r>
+          <w:b/>
+          <w:bCs/>
+          <w:color w:val="15803D"/>
+        </w:rPr>
+        <w:t xml:space="preserve">2.4  </w:t>
+      </w:r>
+      <w:r>
+        <w:rPr>
+          <w:rFonts w:ascii="Calibri" w:cs="Calibri" w:eastAsia="Calibri" w:hAnsi="Calibri"/>
+        </w:rPr>
+        <w:t xml:space="preserve">Click </w:t>
+      </w:r>
+      <w:r>
+        <w:rPr>
+          <w:rFonts w:ascii="Calibri" w:cs="Calibri" w:eastAsia="Calibri" w:hAnsi="Calibri"/>
+          <w:b/>
+          <w:bCs/>
+        </w:rPr>
+        <w:t xml:space="preserve">Deploy</w:t>
+      </w:r>
+      <w:r>
+        <w:rPr>
+          <w:rFonts w:ascii="Calibri" w:cs="Calibri" w:eastAsia="Calibri" w:hAnsi="Calibri"/>
+        </w:rPr>
+        <w:t xml:space="preserve">. The first deploy installs both projects, builds the frontend and bundles the function (about 2–3 minutes).</w:t>
+      </w:r>
+    </w:p>
+    <w:p>
+      <w:pPr>
+        <w:pStyle w:val="Heading3"/>
+        <w:keepNext/>
+        <w:spacing w:after="80" w:before="160"/>
+      </w:pPr>
+      <w:r>
+        <w:rPr>
+          <w:rFonts w:ascii="Calibri" w:cs="Calibri" w:eastAsia="Calibri" w:hAnsi="Calibri"/>
+          <w:b/>
+          <w:bCs/>
+          <w:color w:val="0F172A"/>
+          <w:sz w:val="23"/>
+          <w:szCs w:val="23"/>
+        </w:rPr>
+        <w:t xml:space="preserve">Step 3 — Verify the deployment</w:t>
+      </w:r>
+    </w:p>
+    <w:p>
+      <w:pPr>
+        <w:pStyle w:val="ListParagraph"/>
+        <w:numPr>
+          <w:ilvl w:val="0"/>
+          <w:numId w:val="2"/>
+        </w:numPr>
+        <w:spacing w:after="60" w:line="264"/>
+      </w:pPr>
       <w:r>
         <w:rPr>
           <w:rFonts w:ascii="Consolas" w:cs="Consolas" w:eastAsia="Consolas" w:hAnsi="Consolas"/>
@@ -15827,13 +16214,402 @@
           <w:szCs w:val="20"/>
           <w:shd w:fill="F1F5F9" w:val="clear"/>
         </w:rPr>
+        <w:t xml:space="preserve">https://&lt;your-site&gt;.netlify.app/api/auth/me</w:t>
+      </w:r>
+      <w:r>
+        <w:rPr>
+          <w:rFonts w:ascii="Calibri" w:cs="Calibri" w:eastAsia="Calibri" w:hAnsi="Calibri"/>
+        </w:rPr>
+        <w:t xml:space="preserve"> in a browser returns an empty </w:t>
+      </w:r>
+      <w:r>
+        <w:rPr>
+          <w:rFonts w:ascii="Calibri" w:cs="Calibri" w:eastAsia="Calibri" w:hAnsi="Calibri"/>
+          <w:b/>
+          <w:bCs/>
+        </w:rPr>
+        <w:t xml:space="preserve">401</w:t>
+      </w:r>
+      <w:r>
+        <w:rPr>
+          <w:rFonts w:ascii="Calibri" w:cs="Calibri" w:eastAsia="Calibri" w:hAnsi="Calibri"/>
+        </w:rPr>
+        <w:t xml:space="preserve"> — the function is running.</w:t>
+      </w:r>
+    </w:p>
+    <w:p>
+      <w:pPr>
+        <w:pStyle w:val="ListParagraph"/>
+        <w:numPr>
+          <w:ilvl w:val="0"/>
+          <w:numId w:val="2"/>
+        </w:numPr>
+        <w:spacing w:after="60" w:line="264"/>
+      </w:pPr>
+      <w:r>
+        <w:rPr>
+          <w:rFonts w:ascii="Calibri" w:cs="Calibri" w:eastAsia="Calibri" w:hAnsi="Calibri"/>
+        </w:rPr>
+        <w:t xml:space="preserve">The sign-in page loads and the admin account works. The very first request after a deploy also creates the admin user (seeding is done lazily by the function) and can take a few seconds.</w:t>
+      </w:r>
+    </w:p>
+    <w:p>
+      <w:pPr>
+        <w:pStyle w:val="ListParagraph"/>
+        <w:numPr>
+          <w:ilvl w:val="0"/>
+          <w:numId w:val="2"/>
+        </w:numPr>
+        <w:spacing w:after="60" w:line="264"/>
+      </w:pPr>
+      <w:r>
+        <w:rPr>
+          <w:rFonts w:ascii="Calibri" w:cs="Calibri" w:eastAsia="Calibri" w:hAnsi="Calibri"/>
+        </w:rPr>
+        <w:t xml:space="preserve">Refresh a page such as </w:t>
+      </w:r>
+      <w:r>
+        <w:rPr>
+          <w:rFonts w:ascii="Consolas" w:cs="Consolas" w:eastAsia="Consolas" w:hAnsi="Consolas"/>
+          <w:color w:val="0F172A"/>
+          <w:sz w:val="20"/>
+          <w:szCs w:val="20"/>
+          <w:shd w:fill="F1F5F9" w:val="clear"/>
+        </w:rPr>
+        <w:t xml:space="preserve">/products</w:t>
+      </w:r>
+      <w:r>
+        <w:rPr>
+          <w:rFonts w:ascii="Calibri" w:cs="Calibri" w:eastAsia="Calibri" w:hAnsi="Calibri"/>
+        </w:rPr>
+        <w:t xml:space="preserve">, and open a public link </w:t>
+      </w:r>
+      <w:r>
+        <w:rPr>
+          <w:rFonts w:ascii="Consolas" w:cs="Consolas" w:eastAsia="Consolas" w:hAnsi="Consolas"/>
+          <w:color w:val="0F172A"/>
+          <w:sz w:val="20"/>
+          <w:szCs w:val="20"/>
+          <w:shd w:fill="F1F5F9" w:val="clear"/>
+        </w:rPr>
+        <w:t xml:space="preserve">/invoice/&lt;id&gt;</w:t>
+      </w:r>
+      <w:r>
+        <w:rPr>
+          <w:rFonts w:ascii="Calibri" w:cs="Calibri" w:eastAsia="Calibri" w:hAnsi="Calibri"/>
+        </w:rPr>
+        <w:t xml:space="preserve"> — neither should give a 404.</w:t>
+      </w:r>
+    </w:p>
+    <w:p>
+      <w:pPr>
+        <w:pStyle w:val="ListParagraph"/>
+        <w:numPr>
+          <w:ilvl w:val="0"/>
+          <w:numId w:val="2"/>
+        </w:numPr>
+        <w:spacing w:after="60" w:line="264"/>
+      </w:pPr>
+      <w:r>
+        <w:rPr>
+          <w:rFonts w:ascii="Calibri" w:cs="Calibri" w:eastAsia="Calibri" w:hAnsi="Calibri"/>
+        </w:rPr>
+        <w:t xml:space="preserve">Run the acceptance tests in Section 10 against the Netlify address.</w:t>
+      </w:r>
+    </w:p>
+    <w:p>
+      <w:pPr>
+        <w:pStyle w:val="Heading3"/>
+        <w:keepNext/>
+        <w:spacing w:after="80" w:before="160"/>
+      </w:pPr>
+      <w:r>
+        <w:rPr>
+          <w:rFonts w:ascii="Calibri" w:cs="Calibri" w:eastAsia="Calibri" w:hAnsi="Calibri"/>
+          <w:b/>
+          <w:bCs/>
+          <w:color w:val="0F172A"/>
+          <w:sz w:val="23"/>
+          <w:szCs w:val="23"/>
+        </w:rPr>
+        <w:t xml:space="preserve">Behaviour and limits to know about</w:t>
+      </w:r>
+    </w:p>
+    <w:p>
+      <w:pPr>
+        <w:pStyle w:val="ListParagraph"/>
+        <w:numPr>
+          <w:ilvl w:val="0"/>
+          <w:numId w:val="2"/>
+        </w:numPr>
+        <w:spacing w:after="60" w:line="264"/>
+      </w:pPr>
+      <w:r>
+        <w:rPr>
+          <w:rFonts w:ascii="Calibri" w:cs="Calibri" w:eastAsia="Calibri" w:hAnsi="Calibri"/>
+          <w:b/>
+          <w:bCs/>
+        </w:rPr>
+        <w:t xml:space="preserve">Cold starts:</w:t>
+      </w:r>
+      <w:r>
+        <w:rPr>
+          <w:rFonts w:ascii="Calibri" w:cs="Calibri" w:eastAsia="Calibri" w:hAnsi="Calibri"/>
+        </w:rPr>
+        <w:t xml:space="preserve"> the first request after a quiet period takes roughly half a second to a second longer.</w:t>
+      </w:r>
+    </w:p>
+    <w:p>
+      <w:pPr>
+        <w:pStyle w:val="ListParagraph"/>
+        <w:numPr>
+          <w:ilvl w:val="0"/>
+          <w:numId w:val="2"/>
+        </w:numPr>
+        <w:spacing w:after="60" w:line="264"/>
+      </w:pPr>
+      <w:r>
+        <w:rPr>
+          <w:rFonts w:ascii="Calibri" w:cs="Calibri" w:eastAsia="Calibri" w:hAnsi="Calibri"/>
+          <w:b/>
+          <w:bCs/>
+        </w:rPr>
+        <w:t xml:space="preserve">Distance to the database:</w:t>
+      </w:r>
+      <w:r>
+        <w:rPr>
+          <w:rFonts w:ascii="Calibri" w:cs="Calibri" w:eastAsia="Calibri" w:hAnsi="Calibri"/>
+        </w:rPr>
+        <w:t xml:space="preserve"> Netlify Functions run in a US region by default; a Supabase project in another region (for example Tokyo) adds about 150–200 ms per query, so saving an invoice can take around a second. A Supabase project in a nearer region improves this.</w:t>
+      </w:r>
+    </w:p>
+    <w:p>
+      <w:pPr>
+        <w:pStyle w:val="ListParagraph"/>
+        <w:numPr>
+          <w:ilvl w:val="0"/>
+          <w:numId w:val="2"/>
+        </w:numPr>
+        <w:spacing w:after="60" w:line="264"/>
+      </w:pPr>
+      <w:r>
+        <w:rPr>
+          <w:rFonts w:ascii="Calibri" w:cs="Calibri" w:eastAsia="Calibri" w:hAnsi="Calibri"/>
+          <w:b/>
+          <w:bCs/>
+        </w:rPr>
+        <w:t xml:space="preserve">Limits:</w:t>
+      </w:r>
+      <w:r>
+        <w:rPr>
+          <w:rFonts w:ascii="Calibri" w:cs="Calibri" w:eastAsia="Calibri" w:hAnsi="Calibri"/>
+        </w:rPr>
+        <w:t xml:space="preserve"> function time limit (about 10 s by default) and a 6 MB request size. CSV imports and normal use are far below both.</w:t>
+      </w:r>
+    </w:p>
+    <w:p>
+      <w:pPr>
+        <w:pStyle w:val="ListParagraph"/>
+        <w:numPr>
+          <w:ilvl w:val="0"/>
+          <w:numId w:val="2"/>
+        </w:numPr>
+        <w:spacing w:after="60" w:line="264"/>
+      </w:pPr>
+      <w:r>
+        <w:rPr>
+          <w:rFonts w:ascii="Calibri" w:cs="Calibri" w:eastAsia="Calibri" w:hAnsi="Calibri"/>
+          <w:b/>
+          <w:bCs/>
+        </w:rPr>
+        <w:t xml:space="preserve">Free tier:</w:t>
+      </w:r>
+      <w:r>
+        <w:rPr>
+          <w:rFonts w:ascii="Calibri" w:cs="Calibri" w:eastAsia="Calibri" w:hAnsi="Calibri"/>
+        </w:rPr>
+        <w:t xml:space="preserve"> both Netlify and Supabase have free plans that comfortably cover one shop. Check netlify.com/pricing for current allowances. Supabase free projects pause after about a week of inactivity and must be resumed from the dashboard.</w:t>
+      </w:r>
+    </w:p>
+    <w:p>
+      <w:pPr>
+        <w:pStyle w:val="ListParagraph"/>
+        <w:numPr>
+          <w:ilvl w:val="0"/>
+          <w:numId w:val="2"/>
+        </w:numPr>
+        <w:spacing w:after="60" w:line="264"/>
+      </w:pPr>
+      <w:r>
+        <w:rPr>
+          <w:rFonts w:ascii="Calibri" w:cs="Calibri" w:eastAsia="Calibri" w:hAnsi="Calibri"/>
+          <w:b/>
+          <w:bCs/>
+        </w:rPr>
+        <w:t xml:space="preserve">Secrets:</w:t>
+      </w:r>
+      <w:r>
+        <w:rPr>
+          <w:rFonts w:ascii="Calibri" w:cs="Calibri" w:eastAsia="Calibri" w:hAnsi="Calibri"/>
+        </w:rPr>
+        <w:t xml:space="preserve"> change environment variables in Netlify, then trigger a new deploy for them to take effect.</w:t>
+      </w:r>
+    </w:p>
+    <w:p>
+      <w:pPr>
+        <w:pStyle w:val="Heading3"/>
+        <w:keepNext/>
+        <w:spacing w:after="80" w:before="160"/>
+      </w:pPr>
+      <w:r>
+        <w:rPr>
+          <w:rFonts w:ascii="Calibri" w:cs="Calibri" w:eastAsia="Calibri" w:hAnsi="Calibri"/>
+          <w:b/>
+          <w:bCs/>
+          <w:color w:val="0F172A"/>
+          <w:sz w:val="23"/>
+          <w:szCs w:val="23"/>
+        </w:rPr>
+        <w:t xml:space="preserve">Alternative — frontend on Netlify, API elsewhere</w:t>
+      </w:r>
+    </w:p>
+    <w:p>
+      <w:pPr>
+        <w:spacing w:after="120" w:line="276"/>
+      </w:pPr>
+      <w:r>
+        <w:rPr>
+          <w:rFonts w:ascii="Calibri" w:cs="Calibri" w:eastAsia="Calibri" w:hAnsi="Calibri"/>
+        </w:rPr>
+        <w:t xml:space="preserve">If you prefer a long-running API server, deploy </w:t>
+      </w:r>
+      <w:r>
+        <w:rPr>
+          <w:rFonts w:ascii="Consolas" w:cs="Consolas" w:eastAsia="Consolas" w:hAnsi="Consolas"/>
+          <w:color w:val="0F172A"/>
+          <w:sz w:val="20"/>
+          <w:szCs w:val="20"/>
+          <w:shd w:fill="F1F5F9" w:val="clear"/>
+        </w:rPr>
+        <w:t xml:space="preserve">Backend</w:t>
+      </w:r>
+      <w:r>
+        <w:rPr>
+          <w:rFonts w:ascii="Calibri" w:cs="Calibri" w:eastAsia="Calibri" w:hAnsi="Calibri"/>
+        </w:rPr>
+        <w:t xml:space="preserve"> to any Node host (build </w:t>
+      </w:r>
+      <w:r>
+        <w:rPr>
+          <w:rFonts w:ascii="Consolas" w:cs="Consolas" w:eastAsia="Consolas" w:hAnsi="Consolas"/>
+          <w:color w:val="0F172A"/>
+          <w:sz w:val="20"/>
+          <w:szCs w:val="20"/>
+          <w:shd w:fill="F1F5F9" w:val="clear"/>
+        </w:rPr>
+        <w:t xml:space="preserve">npm ci &amp;&amp; npm run build</w:t>
+      </w:r>
+      <w:r>
+        <w:rPr>
+          <w:rFonts w:ascii="Calibri" w:cs="Calibri" w:eastAsia="Calibri" w:hAnsi="Calibri"/>
+        </w:rPr>
+        <w:t xml:space="preserve">, start </w:t>
+      </w:r>
+      <w:r>
+        <w:rPr>
+          <w:rFonts w:ascii="Consolas" w:cs="Consolas" w:eastAsia="Consolas" w:hAnsi="Consolas"/>
+          <w:color w:val="0F172A"/>
+          <w:sz w:val="20"/>
+          <w:szCs w:val="20"/>
+          <w:shd w:fill="F1F5F9" w:val="clear"/>
+        </w:rPr>
+        <w:t xml:space="preserve">npm start</w:t>
+      </w:r>
+      <w:r>
+        <w:rPr>
+          <w:rFonts w:ascii="Calibri" w:cs="Calibri" w:eastAsia="Calibri" w:hAnsi="Calibri"/>
+        </w:rPr>
+        <w:t xml:space="preserve">) and set </w:t>
+      </w:r>
+      <w:r>
+        <w:rPr>
+          <w:rFonts w:ascii="Consolas" w:cs="Consolas" w:eastAsia="Consolas" w:hAnsi="Consolas"/>
+          <w:color w:val="0F172A"/>
+          <w:sz w:val="20"/>
+          <w:szCs w:val="20"/>
+          <w:shd w:fill="F1F5F9" w:val="clear"/>
+        </w:rPr>
+        <w:t xml:space="preserve">VITE_API_URL</w:t>
+      </w:r>
+      <w:r>
+        <w:rPr>
+          <w:rFonts w:ascii="Calibri" w:cs="Calibri" w:eastAsia="Calibri" w:hAnsi="Calibri"/>
+        </w:rPr>
+        <w:t xml:space="preserve"> to that address with the </w:t>
+      </w:r>
+      <w:r>
+        <w:rPr>
+          <w:rFonts w:ascii="Consolas" w:cs="Consolas" w:eastAsia="Consolas" w:hAnsi="Consolas"/>
+          <w:color w:val="0F172A"/>
+          <w:sz w:val="20"/>
+          <w:szCs w:val="20"/>
+          <w:shd w:fill="F1F5F9" w:val="clear"/>
+        </w:rPr>
+        <w:t xml:space="preserve">/api</w:t>
+      </w:r>
+      <w:r>
+        <w:rPr>
+          <w:rFonts w:ascii="Calibri" w:cs="Calibri" w:eastAsia="Calibri" w:hAnsi="Calibri"/>
+        </w:rPr>
+        <w:t xml:space="preserve"> suffix and </w:t>
+      </w:r>
+      <w:r>
+        <w:rPr>
+          <w:rFonts w:ascii="Consolas" w:cs="Consolas" w:eastAsia="Consolas" w:hAnsi="Consolas"/>
+          <w:color w:val="0F172A"/>
+          <w:sz w:val="20"/>
+          <w:szCs w:val="20"/>
+          <w:shd w:fill="F1F5F9" w:val="clear"/>
+        </w:rPr>
         <w:t xml:space="preserve">CORS_ORIGINS</w:t>
       </w:r>
       <w:r>
         <w:rPr>
           <w:rFonts w:ascii="Calibri" w:cs="Calibri" w:eastAsia="Calibri" w:hAnsi="Calibri"/>
         </w:rPr>
-        <w:t xml:space="preserve"> on the API host and restart the API. Because the frontend and API are then on different origins, CORS is required; sign-in and every API call will fail without it.</w:t>
+        <w:t xml:space="preserve"> on the API host to your Netlify address. In that case remove the </w:t>
+      </w:r>
+      <w:r>
+        <w:rPr>
+          <w:rFonts w:ascii="Consolas" w:cs="Consolas" w:eastAsia="Consolas" w:hAnsi="Consolas"/>
+          <w:color w:val="0F172A"/>
+          <w:sz w:val="20"/>
+          <w:szCs w:val="20"/>
+          <w:shd w:fill="F1F5F9" w:val="clear"/>
+        </w:rPr>
+        <w:t xml:space="preserve">/api/*</w:t>
+      </w:r>
+      <w:r>
+        <w:rPr>
+          <w:rFonts w:ascii="Calibri" w:cs="Calibri" w:eastAsia="Calibri" w:hAnsi="Calibri"/>
+        </w:rPr>
+        <w:t xml:space="preserve"> redirect from </w:t>
+      </w:r>
+      <w:r>
+        <w:rPr>
+          <w:rFonts w:ascii="Consolas" w:cs="Consolas" w:eastAsia="Consolas" w:hAnsi="Consolas"/>
+          <w:color w:val="0F172A"/>
+          <w:sz w:val="20"/>
+          <w:szCs w:val="20"/>
+          <w:shd w:fill="F1F5F9" w:val="clear"/>
+        </w:rPr>
+        <w:t xml:space="preserve">netlify.toml</w:t>
+      </w:r>
+      <w:r>
+        <w:rPr>
+          <w:rFonts w:ascii="Calibri" w:cs="Calibri" w:eastAsia="Calibri" w:hAnsi="Calibri"/>
+        </w:rPr>
+        <w:t xml:space="preserve">.</w:t>
       </w:r>
     </w:p>
     <w:p>

</xml_diff>